<commit_message>
Follow-up report: Word TOC shows static section list before field update
Co-authored-by: arena-agent <297053741+arena-agent@users.noreply.github.com>
</commit_message>
<xml_diff>
--- a/bolo-town/Bolo Town Follow-up Investigative Assessment Report (Oct 13 2026) - DRAFT.docx
+++ b/bolo-town/Bolo Town Follow-up Investigative Assessment Report (Oct 13 2026) - DRAFT.docx
@@ -173,6 +173,9 @@
       </w:r>
     </w:p>
     <w:p>
+      <w:pPr>
+        <w:spacing w:after="40"/>
+      </w:pPr>
       <w:r>
         <w:fldChar w:fldCharType="begin" w:dirty="true"/>
       </w:r>
@@ -183,10 +186,444 @@
         <w:fldChar w:fldCharType="separate"/>
       </w:r>
       <w:r>
-        <w:t>Right-click and choose “Update Field” (or press F9) to build the table of contents.</w:t>
+        <w:rPr>
+          <w:b/>
+          <w:sz w:val="21"/>
+        </w:rPr>
+        <w:t>Executive Summary</w:t>
+      </w:r>
+    </w:p>
+    <w:p>
+      <w:pPr>
+        <w:spacing w:after="40"/>
+      </w:pPr>
+      <w:r>
+        <w:rPr>
+          <w:b/>
+          <w:sz w:val="21"/>
+        </w:rPr>
+        <w:t>Introduction</w:t>
+      </w:r>
+    </w:p>
+    <w:p>
+      <w:pPr>
+        <w:spacing w:after="40"/>
+        <w:ind w:left="432"/>
+      </w:pPr>
+      <w:r>
+        <w:rPr>
+          <w:b w:val="0"/>
+          <w:sz w:val="20"/>
+        </w:rPr>
+        <w:t>Background and Context</w:t>
+      </w:r>
+    </w:p>
+    <w:p>
+      <w:pPr>
+        <w:spacing w:after="40"/>
+      </w:pPr>
+      <w:r>
+        <w:rPr>
+          <w:b/>
+          <w:sz w:val="21"/>
+        </w:rPr>
+        <w:t>Methodology</w:t>
+      </w:r>
+    </w:p>
+    <w:p>
+      <w:pPr>
+        <w:spacing w:after="40"/>
+        <w:ind w:left="432"/>
+      </w:pPr>
+      <w:r>
+        <w:rPr>
+          <w:b w:val="0"/>
+          <w:sz w:val="20"/>
+        </w:rPr>
+        <w:t>Investigative Team Structure</w:t>
+      </w:r>
+    </w:p>
+    <w:p>
+      <w:pPr>
+        <w:spacing w:after="40"/>
+      </w:pPr>
+      <w:r>
+        <w:rPr>
+          <w:b/>
+          <w:sz w:val="21"/>
+        </w:rPr>
+        <w:t>Opening Conference with ArcelorMittal Liberia</w:t>
+      </w:r>
+    </w:p>
+    <w:p>
+      <w:pPr>
+        <w:spacing w:after="40"/>
+        <w:ind w:left="432"/>
+      </w:pPr>
+      <w:r>
+        <w:rPr>
+          <w:b w:val="0"/>
+          <w:sz w:val="20"/>
+        </w:rPr>
+        <w:t>Issue of Obsolete Nitrate Acid</w:t>
+      </w:r>
+    </w:p>
+    <w:p>
+      <w:pPr>
+        <w:spacing w:after="40"/>
+      </w:pPr>
+      <w:r>
+        <w:rPr>
+          <w:b/>
+          <w:sz w:val="21"/>
+        </w:rPr>
+        <w:t>Community Engagement at Bolo Town</w:t>
+      </w:r>
+    </w:p>
+    <w:p>
+      <w:pPr>
+        <w:spacing w:after="40"/>
+        <w:ind w:left="432"/>
+      </w:pPr>
+      <w:r>
+        <w:rPr>
+          <w:b w:val="0"/>
+          <w:sz w:val="20"/>
+        </w:rPr>
+        <w:t>Initial Environmental Pollution Findings</w:t>
+      </w:r>
+    </w:p>
+    <w:p>
+      <w:pPr>
+        <w:spacing w:after="40"/>
+        <w:ind w:left="432"/>
+      </w:pPr>
+      <w:r>
+        <w:rPr>
+          <w:b w:val="0"/>
+          <w:sz w:val="20"/>
+        </w:rPr>
+        <w:t>Assessment of the Extent of the Affected Areas</w:t>
+      </w:r>
+    </w:p>
+    <w:p>
+      <w:pPr>
+        <w:spacing w:after="40"/>
+        <w:ind w:left="432"/>
+      </w:pPr>
+      <w:r>
+        <w:rPr>
+          <w:b w:val="0"/>
+          <w:sz w:val="20"/>
+        </w:rPr>
+        <w:t>Access to Farms and the Damaged-Farm Survey</w:t>
+      </w:r>
+    </w:p>
+    <w:p>
+      <w:pPr>
+        <w:spacing w:after="40"/>
+        <w:ind w:left="432"/>
+      </w:pPr>
+      <w:r>
+        <w:rPr>
+          <w:b w:val="0"/>
+          <w:sz w:val="20"/>
+        </w:rPr>
+        <w:t>Community Concerns Regarding Crop Compensation</w:t>
+      </w:r>
+    </w:p>
+    <w:p>
+      <w:pPr>
+        <w:spacing w:after="40"/>
+        <w:ind w:left="432"/>
+      </w:pPr>
+      <w:r>
+        <w:rPr>
+          <w:b w:val="0"/>
+          <w:sz w:val="20"/>
+        </w:rPr>
+        <w:t>Alleged Failure to Heed Earlier Community Warnings</w:t>
+      </w:r>
+    </w:p>
+    <w:p>
+      <w:pPr>
+        <w:spacing w:after="40"/>
+        <w:ind w:left="432"/>
+      </w:pPr>
+      <w:r>
+        <w:rPr>
+          <w:b w:val="0"/>
+          <w:sz w:val="20"/>
+        </w:rPr>
+        <w:t>AML’s Geofencing Exercise and the Community’s Response</w:t>
+      </w:r>
+    </w:p>
+    <w:p>
+      <w:pPr>
+        <w:spacing w:after="40"/>
+        <w:ind w:left="432"/>
+      </w:pPr>
+      <w:r>
+        <w:rPr>
+          <w:b w:val="0"/>
+          <w:sz w:val="20"/>
+        </w:rPr>
+        <w:t>Community Position on Further Decisions</w:t>
+      </w:r>
+    </w:p>
+    <w:p>
+      <w:pPr>
+        <w:spacing w:after="40"/>
+        <w:ind w:left="432"/>
+      </w:pPr>
+      <w:r>
+        <w:rPr>
+          <w:b w:val="0"/>
+          <w:sz w:val="20"/>
+        </w:rPr>
+        <w:t>AML’s Request for the Investigative Report</w:t>
+      </w:r>
+    </w:p>
+    <w:p>
+      <w:pPr>
+        <w:spacing w:after="40"/>
+        <w:ind w:left="432"/>
+      </w:pPr>
+      <w:r>
+        <w:rPr>
+          <w:b w:val="0"/>
+          <w:sz w:val="20"/>
+        </w:rPr>
+        <w:t>Increasing Tensions during the Consultation</w:t>
+      </w:r>
+    </w:p>
+    <w:p>
+      <w:pPr>
+        <w:spacing w:after="40"/>
+      </w:pPr>
+      <w:r>
+        <w:rPr>
+          <w:b/>
+          <w:sz w:val="21"/>
+        </w:rPr>
+        <w:t>Site Inspection and Physical Observations</w:t>
+      </w:r>
+    </w:p>
+    <w:p>
+      <w:pPr>
+        <w:spacing w:after="40"/>
+        <w:ind w:left="432"/>
+      </w:pPr>
+      <w:r>
+        <w:rPr>
+          <w:b w:val="0"/>
+          <w:sz w:val="20"/>
+        </w:rPr>
+        <w:t>Yeewa, Yeewa Korweny 1 and 2 (ES Group)</w:t>
+      </w:r>
+    </w:p>
+    <w:p>
+      <w:pPr>
+        <w:spacing w:after="40"/>
+        <w:ind w:left="432"/>
+      </w:pPr>
+      <w:r>
+        <w:rPr>
+          <w:b w:val="0"/>
+          <w:sz w:val="20"/>
+        </w:rPr>
+        <w:t>Pompleh and Wehyee Streams (VA Group)</w:t>
+      </w:r>
+    </w:p>
+    <w:p>
+      <w:pPr>
+        <w:spacing w:after="40"/>
+        <w:ind w:left="432"/>
+      </w:pPr>
+      <w:r>
+        <w:rPr>
+          <w:b w:val="0"/>
+          <w:sz w:val="20"/>
+        </w:rPr>
+        <w:t>Wenee, Saymenee, Alphonso Farm and Neneyee (JC Group)</w:t>
+      </w:r>
+    </w:p>
+    <w:p>
+      <w:pPr>
+        <w:spacing w:after="40"/>
+      </w:pPr>
+      <w:r>
+        <w:rPr>
+          <w:b/>
+          <w:sz w:val="21"/>
+        </w:rPr>
+        <w:t>Laboratory Analysis and Quality Assurance/Quality Control (QA/QC)</w:t>
+      </w:r>
+    </w:p>
+    <w:p>
+      <w:pPr>
+        <w:spacing w:after="40"/>
+      </w:pPr>
+      <w:r>
+        <w:rPr>
+          <w:b/>
+          <w:sz w:val="21"/>
+        </w:rPr>
+        <w:t>Water Quality Sampling and Analysis</w:t>
+      </w:r>
+    </w:p>
+    <w:p>
+      <w:pPr>
+        <w:spacing w:after="40"/>
+        <w:ind w:left="432"/>
+      </w:pPr>
+      <w:r>
+        <w:rPr>
+          <w:b w:val="0"/>
+          <w:sz w:val="20"/>
+        </w:rPr>
+        <w:t>Sampling Locations and Rationale</w:t>
+      </w:r>
+    </w:p>
+    <w:p>
+      <w:pPr>
+        <w:spacing w:after="40"/>
+        <w:ind w:left="432"/>
+      </w:pPr>
+      <w:r>
+        <w:rPr>
+          <w:b w:val="0"/>
+          <w:sz w:val="20"/>
+        </w:rPr>
+        <w:t>Analytical Results</w:t>
+      </w:r>
+    </w:p>
+    <w:p>
+      <w:pPr>
+        <w:spacing w:after="40"/>
+      </w:pPr>
+      <w:r>
+        <w:rPr>
+          <w:b/>
+          <w:sz w:val="21"/>
+        </w:rPr>
+        <w:t>Preliminary Interpretation of Results</w:t>
+      </w:r>
+    </w:p>
+    <w:p>
+      <w:pPr>
+        <w:spacing w:after="40"/>
+      </w:pPr>
+      <w:r>
+        <w:rPr>
+          <w:b/>
+          <w:sz w:val="21"/>
+        </w:rPr>
+        <w:t>Environmental and Public Health Impact Assessment</w:t>
+      </w:r>
+    </w:p>
+    <w:p>
+      <w:pPr>
+        <w:spacing w:after="40"/>
+      </w:pPr>
+      <w:r>
+        <w:rPr>
+          <w:b/>
+          <w:sz w:val="21"/>
+        </w:rPr>
+        <w:t>Preliminary Conclusions</w:t>
+      </w:r>
+    </w:p>
+    <w:p>
+      <w:pPr>
+        <w:spacing w:after="40"/>
+      </w:pPr>
+      <w:r>
+        <w:rPr>
+          <w:b/>
+          <w:sz w:val="21"/>
+        </w:rPr>
+        <w:t>Conclusion and Recommendations</w:t>
+      </w:r>
+    </w:p>
+    <w:p>
+      <w:pPr>
+        <w:spacing w:after="40"/>
+        <w:ind w:left="432"/>
+      </w:pPr>
+      <w:r>
+        <w:rPr>
+          <w:b w:val="0"/>
+          <w:sz w:val="20"/>
+        </w:rPr>
+        <w:t>Overall Conclusion</w:t>
+      </w:r>
+    </w:p>
+    <w:p>
+      <w:pPr>
+        <w:spacing w:after="40"/>
+        <w:ind w:left="432"/>
+      </w:pPr>
+      <w:r>
+        <w:rPr>
+          <w:b w:val="0"/>
+          <w:sz w:val="20"/>
+        </w:rPr>
+        <w:t>Recommendations</w:t>
+      </w:r>
+    </w:p>
+    <w:p>
+      <w:pPr>
+        <w:spacing w:after="40"/>
+      </w:pPr>
+      <w:r>
+        <w:rPr>
+          <w:b/>
+          <w:sz w:val="21"/>
+        </w:rPr>
+        <w:t>Appendices</w:t>
+      </w:r>
+    </w:p>
+    <w:p>
+      <w:pPr>
+        <w:spacing w:after="40"/>
+        <w:ind w:left="432"/>
+      </w:pPr>
+      <w:r>
+        <w:rPr>
+          <w:b w:val="0"/>
+          <w:sz w:val="20"/>
+        </w:rPr>
+        <w:t>Appendix A: Photos from the Investigation</w:t>
+      </w:r>
+    </w:p>
+    <w:p>
+      <w:pPr>
+        <w:spacing w:after="40"/>
+        <w:ind w:left="432"/>
+      </w:pPr>
+      <w:r>
+        <w:rPr>
+          <w:b w:val="0"/>
+          <w:sz w:val="20"/>
+        </w:rPr>
+        <w:t>Appendix B: Source Documents</w:t>
       </w:r>
       <w:r>
         <w:fldChar w:fldCharType="end"/>
+      </w:r>
+    </w:p>
+    <w:p>
+      <w:pPr>
+        <w:spacing w:before="160"/>
+      </w:pPr>
+      <w:r>
+        <w:rPr>
+          <w:i/>
+          <w:color w:val="7F7F7F"/>
+          <w:sz w:val="17"/>
+        </w:rPr>
+        <w:t>Page numbers: right-click the list above and choose “Update Field” (or press F9).</w:t>
       </w:r>
     </w:p>
     <w:p>
@@ -1974,7 +2411,20 @@
             <w:shd w:val="clear" w:color="auto" w:fill="404040"/>
             <w:shd w:val="clear" w:color="auto" w:fill="404040"/>
           </w:tcPr>
-          <w:p/>
+          <w:p>
+            <w:pPr>
+              <w:jc w:val="center"/>
+            </w:pPr>
+            <w:r/>
+            <w:r>
+              <w:rPr>
+                <w:b/>
+                <w:color w:val="FFFFFF"/>
+                <w:sz w:val="15"/>
+              </w:rPr>
+              <w:t>Description</w:t>
+            </w:r>
+          </w:p>
         </w:tc>
       </w:tr>
       <w:tr>
@@ -2055,15 +2505,7 @@
           <w:tcPr>
             <w:tcW w:type="dxa" w:w="1656"/>
           </w:tcPr>
-          <w:p>
-            <w:r/>
-            <w:r>
-              <w:rPr>
-                <w:sz w:val="15"/>
-              </w:rPr>
-              <w:t>Wenee Downstream</w:t>
-            </w:r>
-          </w:p>
+          <w:p/>
         </w:tc>
         <w:tc>
           <w:tcPr>
@@ -2086,6 +2528,12 @@
           <w:tcPr>
             <w:tcW w:type="dxa" w:w="979"/>
           </w:tcPr>
+          <w:p/>
+        </w:tc>
+        <w:tc>
+          <w:tcPr>
+            <w:tcW w:type="dxa" w:w="1066"/>
+          </w:tcPr>
           <w:p>
             <w:pPr>
               <w:jc w:val="center"/>
@@ -2095,15 +2543,9 @@
               <w:rPr>
                 <w:sz w:val="15"/>
               </w:rPr>
-              <w:t>0542501</w:t>
+              <w:t>0834879</w:t>
             </w:r>
           </w:p>
-        </w:tc>
-        <w:tc>
-          <w:tcPr>
-            <w:tcW w:type="dxa" w:w="1066"/>
-          </w:tcPr>
-          <w:p/>
         </w:tc>
         <w:tc>
           <w:tcPr>
@@ -2159,18 +2601,7 @@
           <w:tcPr>
             <w:tcW w:type="dxa" w:w="1555"/>
           </w:tcPr>
-          <w:p>
-            <w:pPr>
-              <w:jc w:val="center"/>
-            </w:pPr>
-            <w:r/>
-            <w:r>
-              <w:rPr>
-                <w:sz w:val="15"/>
-              </w:rPr>
-              <w:t>WE-JC-SW-002</w:t>
-            </w:r>
-          </w:p>
+          <w:p/>
         </w:tc>
         <w:tc>
           <w:tcPr>
@@ -2246,7 +2677,15 @@
           <w:tcPr>
             <w:tcW w:type="dxa" w:w="1656"/>
           </w:tcPr>
-          <w:p/>
+          <w:p>
+            <w:r/>
+            <w:r>
+              <w:rPr>
+                <w:sz w:val="15"/>
+              </w:rPr>
+              <w:t>Wenee Upstream (confluence with Saymenee)</w:t>
+            </w:r>
+          </w:p>
         </w:tc>
         <w:tc>
           <w:tcPr>
@@ -2269,13 +2708,35 @@
           <w:tcPr>
             <w:tcW w:type="dxa" w:w="979"/>
           </w:tcPr>
-          <w:p/>
+          <w:p>
+            <w:pPr>
+              <w:jc w:val="center"/>
+            </w:pPr>
+            <w:r/>
+            <w:r>
+              <w:rPr>
+                <w:sz w:val="15"/>
+              </w:rPr>
+              <w:t>0542353</w:t>
+            </w:r>
+          </w:p>
         </w:tc>
         <w:tc>
           <w:tcPr>
             <w:tcW w:type="dxa" w:w="1066"/>
           </w:tcPr>
-          <w:p/>
+          <w:p>
+            <w:pPr>
+              <w:jc w:val="center"/>
+            </w:pPr>
+            <w:r/>
+            <w:r>
+              <w:rPr>
+                <w:sz w:val="15"/>
+              </w:rPr>
+              <w:t>0834524</w:t>
+            </w:r>
+          </w:p>
         </w:tc>
         <w:tc>
           <w:tcPr>
@@ -2331,13 +2792,35 @@
           <w:tcPr>
             <w:tcW w:type="dxa" w:w="1555"/>
           </w:tcPr>
-          <w:p/>
+          <w:p>
+            <w:pPr>
+              <w:jc w:val="center"/>
+            </w:pPr>
+            <w:r/>
+            <w:r>
+              <w:rPr>
+                <w:sz w:val="15"/>
+              </w:rPr>
+              <w:t>SM-SW-JC-001</w:t>
+            </w:r>
+          </w:p>
         </w:tc>
         <w:tc>
           <w:tcPr>
             <w:tcW w:type="dxa" w:w="979"/>
           </w:tcPr>
-          <w:p/>
+          <w:p>
+            <w:pPr>
+              <w:jc w:val="center"/>
+            </w:pPr>
+            <w:r/>
+            <w:r>
+              <w:rPr>
+                <w:sz w:val="15"/>
+              </w:rPr>
+              <w:t>0542304</w:t>
+            </w:r>
+          </w:p>
         </w:tc>
         <w:tc>
           <w:tcPr>
@@ -2396,7 +2879,15 @@
           <w:tcPr>
             <w:tcW w:type="dxa" w:w="1656"/>
           </w:tcPr>
-          <w:p/>
+          <w:p>
+            <w:r/>
+            <w:r>
+              <w:rPr>
+                <w:sz w:val="15"/>
+              </w:rPr>
+              <w:t>Alphonso farm</w:t>
+            </w:r>
+          </w:p>
         </w:tc>
         <w:tc>
           <w:tcPr>
@@ -2453,7 +2944,18 @@
           <w:tcPr>
             <w:tcW w:type="dxa" w:w="893"/>
           </w:tcPr>
-          <w:p/>
+          <w:p>
+            <w:pPr>
+              <w:jc w:val="center"/>
+            </w:pPr>
+            <w:r/>
+            <w:r>
+              <w:rPr>
+                <w:sz w:val="15"/>
+              </w:rPr>
+              <w:t>2:21 PM</w:t>
+            </w:r>
+          </w:p>
         </w:tc>
         <w:tc>
           <w:tcPr>
@@ -2509,7 +3011,18 @@
           <w:tcPr>
             <w:tcW w:type="dxa" w:w="979"/>
           </w:tcPr>
-          <w:p/>
+          <w:p>
+            <w:pPr>
+              <w:jc w:val="center"/>
+            </w:pPr>
+            <w:r/>
+            <w:r>
+              <w:rPr>
+                <w:sz w:val="15"/>
+              </w:rPr>
+              <w:t>7.537928</w:t>
+            </w:r>
+          </w:p>
         </w:tc>
         <w:tc>
           <w:tcPr>
@@ -4365,6 +4878,12 @@
               <w:jc w:val="center"/>
             </w:pPr>
             <w:r/>
+            <w:r>
+              <w:rPr>
+                <w:sz w:val="18"/>
+              </w:rPr>
+              <w:t>Colorimeter</w:t>
+            </w:r>
           </w:p>
         </w:tc>
       </w:tr>
@@ -4387,18 +4906,7 @@
           <w:tcPr>
             <w:tcW w:type="dxa" w:w="2736"/>
           </w:tcPr>
-          <w:p>
-            <w:pPr>
-              <w:jc w:val="center"/>
-            </w:pPr>
-            <w:r/>
-            <w:r>
-              <w:rPr>
-                <w:sz w:val="18"/>
-              </w:rPr>
-              <w:t>523</w:t>
-            </w:r>
-          </w:p>
+          <w:p/>
         </w:tc>
         <w:tc>
           <w:tcPr>
@@ -4481,7 +4989,18 @@
           <w:tcPr>
             <w:tcW w:type="dxa" w:w="2736"/>
           </w:tcPr>
-          <w:p/>
+          <w:p>
+            <w:pPr>
+              <w:jc w:val="center"/>
+            </w:pPr>
+            <w:r/>
+            <w:r>
+              <w:rPr>
+                <w:sz w:val="18"/>
+              </w:rPr>
+              <w:t>1858</w:t>
+            </w:r>
+          </w:p>
         </w:tc>
         <w:tc>
           <w:tcPr>
@@ -4683,21 +5202,24 @@
           <w:tcPr>
             <w:tcW w:type="dxa" w:w="2448"/>
           </w:tcPr>
+          <w:p/>
+        </w:tc>
+        <w:tc>
+          <w:tcPr>
+            <w:tcW w:type="dxa" w:w="2736"/>
+          </w:tcPr>
           <w:p>
+            <w:pPr>
+              <w:jc w:val="center"/>
+            </w:pPr>
             <w:r/>
             <w:r>
               <w:rPr>
                 <w:sz w:val="18"/>
               </w:rPr>
-              <w:t>YWK1-ES-SW-003</w:t>
+              <w:t>188</w:t>
             </w:r>
           </w:p>
-        </w:tc>
-        <w:tc>
-          <w:tcPr>
-            <w:tcW w:type="dxa" w:w="2736"/>
-          </w:tcPr>
-          <w:p/>
         </w:tc>
         <w:tc>
           <w:tcPr>
@@ -4719,7 +5241,15 @@
           <w:tcPr>
             <w:tcW w:type="dxa" w:w="2448"/>
           </w:tcPr>
-          <w:p/>
+          <w:p>
+            <w:r/>
+            <w:r>
+              <w:rPr>
+                <w:sz w:val="18"/>
+              </w:rPr>
+              <w:t>W-SW-VA-001</w:t>
+            </w:r>
+          </w:p>
         </w:tc>
         <w:tc>
           <w:tcPr>
@@ -4811,7 +5341,18 @@
           <w:tcPr>
             <w:tcW w:type="dxa" w:w="2736"/>
           </w:tcPr>
-          <w:p/>
+          <w:p>
+            <w:pPr>
+              <w:jc w:val="center"/>
+            </w:pPr>
+            <w:r/>
+            <w:r>
+              <w:rPr>
+                <w:sz w:val="18"/>
+              </w:rPr>
+              <w:t>20</w:t>
+            </w:r>
+          </w:p>
         </w:tc>
         <w:tc>
           <w:tcPr>
@@ -4925,7 +5466,18 @@
           <w:tcPr>
             <w:tcW w:type="dxa" w:w="2736"/>
           </w:tcPr>
-          <w:p/>
+          <w:p>
+            <w:pPr>
+              <w:jc w:val="center"/>
+            </w:pPr>
+            <w:r/>
+            <w:r>
+              <w:rPr>
+                <w:sz w:val="18"/>
+              </w:rPr>
+              <w:t>164</w:t>
+            </w:r>
+          </w:p>
         </w:tc>
         <w:tc>
           <w:tcPr>
@@ -4947,7 +5499,15 @@
           <w:tcPr>
             <w:tcW w:type="dxa" w:w="2448"/>
           </w:tcPr>
-          <w:p/>
+          <w:p>
+            <w:r/>
+            <w:r>
+              <w:rPr>
+                <w:sz w:val="18"/>
+              </w:rPr>
+              <w:t>WE-JC-SW-001</w:t>
+            </w:r>
+          </w:p>
         </w:tc>
         <w:tc>
           <w:tcPr>
@@ -4992,35 +5552,18 @@
           <w:tcPr>
             <w:tcW w:type="dxa" w:w="2736"/>
           </w:tcPr>
-          <w:p/>
-        </w:tc>
-        <w:tc>
-          <w:tcPr>
-            <w:tcW w:type="dxa" w:w="2437"/>
-            <w:vMerge/>
-          </w:tcPr>
-          <w:p/>
-        </w:tc>
-        <w:tc>
-          <w:tcPr>
-            <w:tcW w:type="dxa" w:w="2437"/>
-            <w:vMerge/>
-          </w:tcPr>
-          <w:p/>
-        </w:tc>
-      </w:tr>
-      <w:tr>
-        <w:tc>
-          <w:tcPr>
-            <w:tcW w:type="dxa" w:w="2448"/>
-          </w:tcPr>
-          <w:p/>
-        </w:tc>
-        <w:tc>
-          <w:tcPr>
-            <w:tcW w:type="dxa" w:w="2736"/>
-          </w:tcPr>
-          <w:p/>
+          <w:p>
+            <w:pPr>
+              <w:jc w:val="center"/>
+            </w:pPr>
+            <w:r/>
+            <w:r>
+              <w:rPr>
+                <w:sz w:val="18"/>
+              </w:rPr>
+              <w:t>118</w:t>
+            </w:r>
+          </w:p>
         </w:tc>
         <w:tc>
           <w:tcPr>
@@ -5048,9 +5591,48 @@
               <w:rPr>
                 <w:sz w:val="18"/>
               </w:rPr>
-              <w:t>SM-SW-JC-001</w:t>
+              <w:t>WE-SW-JC-003</w:t>
             </w:r>
           </w:p>
+        </w:tc>
+        <w:tc>
+          <w:tcPr>
+            <w:tcW w:type="dxa" w:w="2736"/>
+          </w:tcPr>
+          <w:p>
+            <w:pPr>
+              <w:jc w:val="center"/>
+            </w:pPr>
+            <w:r/>
+            <w:r>
+              <w:rPr>
+                <w:sz w:val="18"/>
+              </w:rPr>
+              <w:t>214</w:t>
+            </w:r>
+          </w:p>
+        </w:tc>
+        <w:tc>
+          <w:tcPr>
+            <w:tcW w:type="dxa" w:w="2437"/>
+            <w:vMerge/>
+          </w:tcPr>
+          <w:p/>
+        </w:tc>
+        <w:tc>
+          <w:tcPr>
+            <w:tcW w:type="dxa" w:w="2437"/>
+            <w:vMerge/>
+          </w:tcPr>
+          <w:p/>
+        </w:tc>
+      </w:tr>
+      <w:tr>
+        <w:tc>
+          <w:tcPr>
+            <w:tcW w:type="dxa" w:w="2448"/>
+          </w:tcPr>
+          <w:p/>
         </w:tc>
         <w:tc>
           <w:tcPr>
@@ -5298,7 +5880,20 @@
             <w:tcW w:type="dxa" w:w="2952"/>
             <w:shd w:val="clear" w:color="auto" w:fill="404040"/>
           </w:tcPr>
-          <w:p/>
+          <w:p>
+            <w:pPr>
+              <w:jc w:val="center"/>
+            </w:pPr>
+            <w:r/>
+            <w:r>
+              <w:rPr>
+                <w:b/>
+                <w:color w:val="FFFFFF"/>
+                <w:sz w:val="17"/>
+              </w:rPr>
+              <w:t>Relative to LWQS Class III (≤50 mg/L)</w:t>
+            </w:r>
+          </w:p>
         </w:tc>
       </w:tr>
       <w:tr>

</xml_diff>

<commit_message>
Follow-up report: add four JC group photos as Plates 5-8 in Appendix A
Co-authored-by: arena-agent <297053741+arena-agent@users.noreply.github.com>
</commit_message>
<xml_diff>
--- a/bolo-town/Bolo Town Follow-up Investigative Assessment Report (Oct 13 2026) - DRAFT.docx
+++ b/bolo-town/Bolo Town Follow-up Investigative Assessment Report (Oct 13 2026) - DRAFT.docx
@@ -2126,6 +2126,15 @@
     </w:p>
     <w:p>
       <w:pPr>
+        <w:spacing w:after="120" w:line="276" w:lineRule="auto"/>
+        <w:jc w:val="both"/>
+      </w:pPr>
+      <w:r>
+        <w:t>Photographs taken by the JC group during sampling show reddish-brown, visibly turbid water with iron-rich sediment blanketing the stream beds and banks, and low-lying land inundated by sediment-laden water (see Appendix A, Plates 5–8).</w:t>
+      </w:r>
+    </w:p>
+    <w:p>
+      <w:pPr>
         <w:spacing w:after="120"/>
       </w:pPr>
       <w:r>
@@ -2133,7 +2142,7 @@
           <w:i/>
           <w:color w:val="7F7F7F"/>
         </w:rPr>
-        <w:t>[To be added: Physical observations of the JC group at the Wenee, Saymenee, Alphonso farm and Neneyee sampling points.]</w:t>
+        <w:t>[To be added: Written physical observations of the JC group at the Wenee, Saymenee, Alphonso farm and Neneyee sampling points.]</w:t>
       </w:r>
     </w:p>
     <w:p>
@@ -2470,20 +2479,7 @@
             <w:tcW w:type="dxa" w:w="1066"/>
             <w:shd w:val="clear" w:color="auto" w:fill="404040"/>
           </w:tcPr>
-          <w:p>
-            <w:pPr>
-              <w:jc w:val="center"/>
-            </w:pPr>
-            <w:r/>
-            <w:r>
-              <w:rPr>
-                <w:b/>
-                <w:color w:val="FFFFFF"/>
-                <w:sz w:val="15"/>
-              </w:rPr>
-              <w:t>Longitude</w:t>
-            </w:r>
-          </w:p>
+          <w:p/>
         </w:tc>
         <w:tc>
           <w:tcPr>
@@ -2505,7 +2501,15 @@
           <w:tcPr>
             <w:tcW w:type="dxa" w:w="1656"/>
           </w:tcPr>
-          <w:p/>
+          <w:p>
+            <w:r/>
+            <w:r>
+              <w:rPr>
+                <w:sz w:val="15"/>
+              </w:rPr>
+              <w:t>Wenee Downstream</w:t>
+            </w:r>
+          </w:p>
         </w:tc>
         <w:tc>
           <w:tcPr>
@@ -2528,7 +2532,18 @@
           <w:tcPr>
             <w:tcW w:type="dxa" w:w="979"/>
           </w:tcPr>
-          <w:p/>
+          <w:p>
+            <w:pPr>
+              <w:jc w:val="center"/>
+            </w:pPr>
+            <w:r/>
+            <w:r>
+              <w:rPr>
+                <w:sz w:val="15"/>
+              </w:rPr>
+              <w:t>0542501</w:t>
+            </w:r>
+          </w:p>
         </w:tc>
         <w:tc>
           <w:tcPr>
@@ -2677,32 +2692,13 @@
           <w:tcPr>
             <w:tcW w:type="dxa" w:w="1656"/>
           </w:tcPr>
-          <w:p>
-            <w:r/>
-            <w:r>
-              <w:rPr>
-                <w:sz w:val="15"/>
-              </w:rPr>
-              <w:t>Wenee Upstream (confluence with Saymenee)</w:t>
-            </w:r>
-          </w:p>
+          <w:p/>
         </w:tc>
         <w:tc>
           <w:tcPr>
             <w:tcW w:type="dxa" w:w="1555"/>
           </w:tcPr>
-          <w:p>
-            <w:pPr>
-              <w:jc w:val="center"/>
-            </w:pPr>
-            <w:r/>
-            <w:r>
-              <w:rPr>
-                <w:sz w:val="15"/>
-              </w:rPr>
-              <w:t>WE-SW-JC-003</w:t>
-            </w:r>
-          </w:p>
+          <w:p/>
         </w:tc>
         <w:tc>
           <w:tcPr>
@@ -2725,22 +2721,51 @@
           <w:tcPr>
             <w:tcW w:type="dxa" w:w="1066"/>
           </w:tcPr>
+          <w:p/>
+        </w:tc>
+        <w:tc>
+          <w:tcPr>
+            <w:tcW w:type="dxa" w:w="893"/>
+          </w:tcPr>
+          <w:p/>
+        </w:tc>
+        <w:tc>
+          <w:tcPr>
+            <w:tcW w:type="dxa" w:w="3600"/>
+          </w:tcPr>
+          <w:p/>
+        </w:tc>
+      </w:tr>
+      <w:tr>
+        <w:tc>
+          <w:tcPr>
+            <w:tcW w:type="dxa" w:w="1656"/>
+          </w:tcPr>
           <w:p>
-            <w:pPr>
-              <w:jc w:val="center"/>
-            </w:pPr>
             <w:r/>
             <w:r>
               <w:rPr>
                 <w:sz w:val="15"/>
               </w:rPr>
-              <w:t>0834524</w:t>
+              <w:t>Saymenee mid-point</w:t>
             </w:r>
           </w:p>
         </w:tc>
         <w:tc>
           <w:tcPr>
-            <w:tcW w:type="dxa" w:w="893"/>
+            <w:tcW w:type="dxa" w:w="1555"/>
+          </w:tcPr>
+          <w:p/>
+        </w:tc>
+        <w:tc>
+          <w:tcPr>
+            <w:tcW w:type="dxa" w:w="979"/>
+          </w:tcPr>
+          <w:p/>
+        </w:tc>
+        <w:tc>
+          <w:tcPr>
+            <w:tcW w:type="dxa" w:w="1066"/>
           </w:tcPr>
           <w:p>
             <w:pPr>
@@ -2751,9 +2776,15 @@
               <w:rPr>
                 <w:sz w:val="15"/>
               </w:rPr>
-              <w:t>2:36 PM</w:t>
+              <w:t>0834561</w:t>
             </w:r>
           </w:p>
+        </w:tc>
+        <w:tc>
+          <w:tcPr>
+            <w:tcW w:type="dxa" w:w="893"/>
+          </w:tcPr>
+          <w:p/>
         </w:tc>
         <w:tc>
           <w:tcPr>
@@ -2778,116 +2809,7 @@
           <w:tcPr>
             <w:tcW w:type="dxa" w:w="1656"/>
           </w:tcPr>
-          <w:p>
-            <w:r/>
-            <w:r>
-              <w:rPr>
-                <w:sz w:val="15"/>
-              </w:rPr>
-              <w:t>Saymenee mid-point</w:t>
-            </w:r>
-          </w:p>
-        </w:tc>
-        <w:tc>
-          <w:tcPr>
-            <w:tcW w:type="dxa" w:w="1555"/>
-          </w:tcPr>
-          <w:p>
-            <w:pPr>
-              <w:jc w:val="center"/>
-            </w:pPr>
-            <w:r/>
-            <w:r>
-              <w:rPr>
-                <w:sz w:val="15"/>
-              </w:rPr>
-              <w:t>SM-SW-JC-001</w:t>
-            </w:r>
-          </w:p>
-        </w:tc>
-        <w:tc>
-          <w:tcPr>
-            <w:tcW w:type="dxa" w:w="979"/>
-          </w:tcPr>
-          <w:p>
-            <w:pPr>
-              <w:jc w:val="center"/>
-            </w:pPr>
-            <w:r/>
-            <w:r>
-              <w:rPr>
-                <w:sz w:val="15"/>
-              </w:rPr>
-              <w:t>0542304</w:t>
-            </w:r>
-          </w:p>
-        </w:tc>
-        <w:tc>
-          <w:tcPr>
-            <w:tcW w:type="dxa" w:w="1066"/>
-          </w:tcPr>
-          <w:p>
-            <w:pPr>
-              <w:jc w:val="center"/>
-            </w:pPr>
-            <w:r/>
-            <w:r>
-              <w:rPr>
-                <w:sz w:val="15"/>
-              </w:rPr>
-              <w:t>0834561</w:t>
-            </w:r>
-          </w:p>
-        </w:tc>
-        <w:tc>
-          <w:tcPr>
-            <w:tcW w:type="dxa" w:w="893"/>
-          </w:tcPr>
-          <w:p>
-            <w:pPr>
-              <w:jc w:val="center"/>
-            </w:pPr>
-            <w:r/>
-            <w:r>
-              <w:rPr>
-                <w:sz w:val="15"/>
-              </w:rPr>
-              <w:t>2:45 PM</w:t>
-            </w:r>
-          </w:p>
-        </w:tc>
-        <w:tc>
-          <w:tcPr>
-            <w:tcW w:type="dxa" w:w="3600"/>
-          </w:tcPr>
-          <w:p>
-            <w:pPr>
-              <w:jc w:val="center"/>
-            </w:pPr>
-            <w:r/>
-            <w:r>
-              <w:rPr>
-                <w:sz w:val="15"/>
-              </w:rPr>
-              <w:t>—</w:t>
-            </w:r>
-          </w:p>
-        </w:tc>
-      </w:tr>
-      <w:tr>
-        <w:tc>
-          <w:tcPr>
-            <w:tcW w:type="dxa" w:w="1656"/>
-          </w:tcPr>
-          <w:p>
-            <w:r/>
-            <w:r>
-              <w:rPr>
-                <w:sz w:val="15"/>
-              </w:rPr>
-              <w:t>Alphonso farm</w:t>
-            </w:r>
-          </w:p>
+          <w:p/>
         </w:tc>
         <w:tc>
           <w:tcPr>
@@ -2910,18 +2832,7 @@
           <w:tcPr>
             <w:tcW w:type="dxa" w:w="979"/>
           </w:tcPr>
-          <w:p>
-            <w:pPr>
-              <w:jc w:val="center"/>
-            </w:pPr>
-            <w:r/>
-            <w:r>
-              <w:rPr>
-                <w:sz w:val="15"/>
-              </w:rPr>
-              <w:t>7.547899</w:t>
-            </w:r>
-          </w:p>
+          <w:p/>
         </w:tc>
         <w:tc>
           <w:tcPr>
@@ -2961,18 +2872,7 @@
           <w:tcPr>
             <w:tcW w:type="dxa" w:w="3600"/>
           </w:tcPr>
-          <w:p>
-            <w:pPr>
-              <w:jc w:val="center"/>
-            </w:pPr>
-            <w:r/>
-            <w:r>
-              <w:rPr>
-                <w:sz w:val="15"/>
-              </w:rPr>
-              <w:t>—</w:t>
-            </w:r>
-          </w:p>
+          <w:p/>
         </w:tc>
       </w:tr>
       <w:tr>
@@ -2994,18 +2894,7 @@
           <w:tcPr>
             <w:tcW w:type="dxa" w:w="1555"/>
           </w:tcPr>
-          <w:p>
-            <w:pPr>
-              <w:jc w:val="center"/>
-            </w:pPr>
-            <w:r/>
-            <w:r>
-              <w:rPr>
-                <w:sz w:val="15"/>
-              </w:rPr>
-              <w:t>NEN-SW-JC-001</w:t>
-            </w:r>
-          </w:p>
+          <w:p/>
         </w:tc>
         <w:tc>
           <w:tcPr>
@@ -4878,12 +4767,6 @@
               <w:jc w:val="center"/>
             </w:pPr>
             <w:r/>
-            <w:r>
-              <w:rPr>
-                <w:sz w:val="18"/>
-              </w:rPr>
-              <w:t>Colorimeter</w:t>
-            </w:r>
           </w:p>
         </w:tc>
       </w:tr>
@@ -4906,7 +4789,18 @@
           <w:tcPr>
             <w:tcW w:type="dxa" w:w="2736"/>
           </w:tcPr>
-          <w:p/>
+          <w:p>
+            <w:pPr>
+              <w:jc w:val="center"/>
+            </w:pPr>
+            <w:r/>
+            <w:r>
+              <w:rPr>
+                <w:sz w:val="18"/>
+              </w:rPr>
+              <w:t>523</w:t>
+            </w:r>
+          </w:p>
         </w:tc>
         <w:tc>
           <w:tcPr>
@@ -5036,18 +4930,7 @@
           <w:tcPr>
             <w:tcW w:type="dxa" w:w="2736"/>
           </w:tcPr>
-          <w:p>
-            <w:pPr>
-              <w:jc w:val="center"/>
-            </w:pPr>
-            <w:r/>
-            <w:r>
-              <w:rPr>
-                <w:sz w:val="18"/>
-              </w:rPr>
-              <w:t>2,400</w:t>
-            </w:r>
-          </w:p>
+          <w:p/>
         </w:tc>
         <w:tc>
           <w:tcPr>
@@ -5069,24 +4952,21 @@
           <w:tcPr>
             <w:tcW w:type="dxa" w:w="2448"/>
           </w:tcPr>
-          <w:p/>
+          <w:p>
+            <w:r/>
+            <w:r>
+              <w:rPr>
+                <w:sz w:val="18"/>
+              </w:rPr>
+              <w:t>YWK2-ES-SW-003</w:t>
+            </w:r>
+          </w:p>
         </w:tc>
         <w:tc>
           <w:tcPr>
             <w:tcW w:type="dxa" w:w="2736"/>
           </w:tcPr>
-          <w:p>
-            <w:pPr>
-              <w:jc w:val="center"/>
-            </w:pPr>
-            <w:r/>
-            <w:r>
-              <w:rPr>
-                <w:sz w:val="18"/>
-              </w:rPr>
-              <w:t>769</w:t>
-            </w:r>
-          </w:p>
+          <w:p/>
         </w:tc>
         <w:tc>
           <w:tcPr>
@@ -5155,71 +5035,13 @@
           <w:tcPr>
             <w:tcW w:type="dxa" w:w="2448"/>
           </w:tcPr>
-          <w:p>
-            <w:r/>
-            <w:r>
-              <w:rPr>
-                <w:sz w:val="18"/>
-              </w:rPr>
-              <w:t>YWK1-ES-SW-002</w:t>
-            </w:r>
-          </w:p>
-        </w:tc>
-        <w:tc>
-          <w:tcPr>
-            <w:tcW w:type="dxa" w:w="2736"/>
-          </w:tcPr>
-          <w:p>
-            <w:pPr>
-              <w:jc w:val="center"/>
-            </w:pPr>
-            <w:r/>
-            <w:r>
-              <w:rPr>
-                <w:sz w:val="18"/>
-              </w:rPr>
-              <w:t>246</w:t>
-            </w:r>
-          </w:p>
-        </w:tc>
-        <w:tc>
-          <w:tcPr>
-            <w:tcW w:type="dxa" w:w="2437"/>
-            <w:vMerge/>
-          </w:tcPr>
-          <w:p/>
-        </w:tc>
-        <w:tc>
-          <w:tcPr>
-            <w:tcW w:type="dxa" w:w="2437"/>
-            <w:vMerge/>
-          </w:tcPr>
-          <w:p/>
-        </w:tc>
-      </w:tr>
-      <w:tr>
-        <w:tc>
-          <w:tcPr>
-            <w:tcW w:type="dxa" w:w="2448"/>
-          </w:tcPr>
           <w:p/>
         </w:tc>
         <w:tc>
           <w:tcPr>
             <w:tcW w:type="dxa" w:w="2736"/>
           </w:tcPr>
-          <w:p>
-            <w:pPr>
-              <w:jc w:val="center"/>
-            </w:pPr>
-            <w:r/>
-            <w:r>
-              <w:rPr>
-                <w:sz w:val="18"/>
-              </w:rPr>
-              <w:t>188</w:t>
-            </w:r>
-          </w:p>
+          <w:p/>
         </w:tc>
         <w:tc>
           <w:tcPr>
@@ -5247,7 +5069,7 @@
               <w:rPr>
                 <w:sz w:val="18"/>
               </w:rPr>
-              <w:t>W-SW-VA-001</w:t>
+              <w:t>YWK1-ES-SW-003</w:t>
             </w:r>
           </w:p>
         </w:tc>
@@ -5264,7 +5086,7 @@
               <w:rPr>
                 <w:sz w:val="18"/>
               </w:rPr>
-              <w:t>24</w:t>
+              <w:t>188</w:t>
             </w:r>
           </w:p>
         </w:tc>
@@ -5306,6 +5128,42 @@
               <w:t>24</w:t>
             </w:r>
           </w:p>
+        </w:tc>
+        <w:tc>
+          <w:tcPr>
+            <w:tcW w:type="dxa" w:w="2437"/>
+            <w:vMerge/>
+          </w:tcPr>
+          <w:p/>
+        </w:tc>
+        <w:tc>
+          <w:tcPr>
+            <w:tcW w:type="dxa" w:w="2437"/>
+            <w:vMerge/>
+          </w:tcPr>
+          <w:p/>
+        </w:tc>
+      </w:tr>
+      <w:tr>
+        <w:tc>
+          <w:tcPr>
+            <w:tcW w:type="dxa" w:w="2448"/>
+          </w:tcPr>
+          <w:p>
+            <w:r/>
+            <w:r>
+              <w:rPr>
+                <w:sz w:val="18"/>
+              </w:rPr>
+              <w:t>W-SW-VA-002</w:t>
+            </w:r>
+          </w:p>
+        </w:tc>
+        <w:tc>
+          <w:tcPr>
+            <w:tcW w:type="dxa" w:w="2736"/>
+          </w:tcPr>
+          <w:p/>
         </w:tc>
         <w:tc>
           <w:tcPr>
@@ -5380,18 +5238,7 @@
           <w:tcPr>
             <w:tcW w:type="dxa" w:w="2736"/>
           </w:tcPr>
-          <w:p>
-            <w:pPr>
-              <w:jc w:val="center"/>
-            </w:pPr>
-            <w:r/>
-            <w:r>
-              <w:rPr>
-                <w:sz w:val="18"/>
-              </w:rPr>
-              <w:t>11</w:t>
-            </w:r>
-          </w:p>
+          <w:p/>
         </w:tc>
         <w:tc>
           <w:tcPr>
@@ -5427,18 +5274,7 @@
           <w:tcPr>
             <w:tcW w:type="dxa" w:w="2736"/>
           </w:tcPr>
-          <w:p>
-            <w:pPr>
-              <w:jc w:val="center"/>
-            </w:pPr>
-            <w:r/>
-            <w:r>
-              <w:rPr>
-                <w:sz w:val="18"/>
-              </w:rPr>
-              <w:t>24</w:t>
-            </w:r>
-          </w:p>
+          <w:p/>
         </w:tc>
         <w:tc>
           <w:tcPr>
@@ -5466,65 +5302,7 @@
           <w:tcPr>
             <w:tcW w:type="dxa" w:w="2736"/>
           </w:tcPr>
-          <w:p>
-            <w:pPr>
-              <w:jc w:val="center"/>
-            </w:pPr>
-            <w:r/>
-            <w:r>
-              <w:rPr>
-                <w:sz w:val="18"/>
-              </w:rPr>
-              <w:t>164</w:t>
-            </w:r>
-          </w:p>
-        </w:tc>
-        <w:tc>
-          <w:tcPr>
-            <w:tcW w:type="dxa" w:w="2437"/>
-            <w:vMerge/>
-          </w:tcPr>
           <w:p/>
-        </w:tc>
-        <w:tc>
-          <w:tcPr>
-            <w:tcW w:type="dxa" w:w="2437"/>
-            <w:vMerge/>
-          </w:tcPr>
-          <w:p/>
-        </w:tc>
-      </w:tr>
-      <w:tr>
-        <w:tc>
-          <w:tcPr>
-            <w:tcW w:type="dxa" w:w="2448"/>
-          </w:tcPr>
-          <w:p>
-            <w:r/>
-            <w:r>
-              <w:rPr>
-                <w:sz w:val="18"/>
-              </w:rPr>
-              <w:t>WE-JC-SW-001</w:t>
-            </w:r>
-          </w:p>
-        </w:tc>
-        <w:tc>
-          <w:tcPr>
-            <w:tcW w:type="dxa" w:w="2736"/>
-          </w:tcPr>
-          <w:p>
-            <w:pPr>
-              <w:jc w:val="center"/>
-            </w:pPr>
-            <w:r/>
-            <w:r>
-              <w:rPr>
-                <w:sz w:val="18"/>
-              </w:rPr>
-              <w:t>102</w:t>
-            </w:r>
-          </w:p>
         </w:tc>
         <w:tc>
           <w:tcPr>
@@ -5552,18 +5330,35 @@
           <w:tcPr>
             <w:tcW w:type="dxa" w:w="2736"/>
           </w:tcPr>
-          <w:p>
-            <w:pPr>
-              <w:jc w:val="center"/>
-            </w:pPr>
-            <w:r/>
-            <w:r>
-              <w:rPr>
-                <w:sz w:val="18"/>
-              </w:rPr>
-              <w:t>118</w:t>
-            </w:r>
-          </w:p>
+          <w:p/>
+        </w:tc>
+        <w:tc>
+          <w:tcPr>
+            <w:tcW w:type="dxa" w:w="2437"/>
+            <w:vMerge/>
+          </w:tcPr>
+          <w:p/>
+        </w:tc>
+        <w:tc>
+          <w:tcPr>
+            <w:tcW w:type="dxa" w:w="2437"/>
+            <w:vMerge/>
+          </w:tcPr>
+          <w:p/>
+        </w:tc>
+      </w:tr>
+      <w:tr>
+        <w:tc>
+          <w:tcPr>
+            <w:tcW w:type="dxa" w:w="2448"/>
+          </w:tcPr>
+          <w:p/>
+        </w:tc>
+        <w:tc>
+          <w:tcPr>
+            <w:tcW w:type="dxa" w:w="2736"/>
+          </w:tcPr>
+          <w:p/>
         </w:tc>
         <w:tc>
           <w:tcPr>
@@ -5915,15 +5710,7 @@
           <w:tcPr>
             <w:tcW w:type="dxa" w:w="2736"/>
           </w:tcPr>
-          <w:p>
-            <w:r/>
-            <w:r>
-              <w:rPr>
-                <w:sz w:val="17"/>
-              </w:rPr>
-              <w:t>YEEWA-DS / MS / US</w:t>
-            </w:r>
-          </w:p>
+          <w:p/>
         </w:tc>
         <w:tc>
           <w:tcPr>
@@ -5990,32 +5777,13 @@
           <w:tcPr>
             <w:tcW w:type="dxa" w:w="1728"/>
           </w:tcPr>
-          <w:p>
-            <w:pPr>
-              <w:jc w:val="center"/>
-            </w:pPr>
-            <w:r/>
-            <w:r>
-              <w:rPr>
-                <w:sz w:val="17"/>
-              </w:rPr>
-              <w:t>769 – 2,400</w:t>
-            </w:r>
-          </w:p>
+          <w:p/>
         </w:tc>
         <w:tc>
           <w:tcPr>
             <w:tcW w:type="dxa" w:w="2952"/>
           </w:tcPr>
-          <w:p>
-            <w:r/>
-            <w:r>
-              <w:rPr>
-                <w:sz w:val="17"/>
-              </w:rPr>
-              <w:t>All exceed (≈15–48×); highest of the survey</w:t>
-            </w:r>
-          </w:p>
+          <w:p/>
         </w:tc>
       </w:tr>
       <w:tr>
@@ -6037,15 +5805,7 @@
           <w:tcPr>
             <w:tcW w:type="dxa" w:w="2736"/>
           </w:tcPr>
-          <w:p>
-            <w:r/>
-            <w:r>
-              <w:rPr>
-                <w:sz w:val="17"/>
-              </w:rPr>
-              <w:t>YWK1-ES-SW-001 – 003</w:t>
-            </w:r>
-          </w:p>
+          <w:p/>
         </w:tc>
         <w:tc>
           <w:tcPr>
@@ -7027,6 +6787,264 @@
     </w:tbl>
     <w:p/>
     <w:p>
+      <w:r>
+        <w:br w:type="page"/>
+      </w:r>
+    </w:p>
+    <w:p>
+      <w:pPr>
+        <w:spacing w:after="120" w:line="276" w:lineRule="auto"/>
+        <w:jc w:val="both"/>
+      </w:pPr>
+      <w:r>
+        <w:t>Plates 5–8: JC group sampling along the Wenee, Saymenee, Alphonso farm and Neneyee sampling points, Bolo Town, Nimba County, October 13, 2026.</w:t>
+      </w:r>
+    </w:p>
+    <w:tbl>
+      <w:tblPr>
+        <w:tblW w:type="auto" w:w="0"/>
+        <w:jc w:val="center"/>
+        <w:tblLook w:firstColumn="1" w:firstRow="1" w:lastColumn="0" w:lastRow="0" w:noHBand="0" w:noVBand="1" w:val="04A0"/>
+      </w:tblPr>
+      <w:tblGrid>
+        <w:gridCol w:w="4874"/>
+        <w:gridCol w:w="4874"/>
+      </w:tblGrid>
+      <w:tr>
+        <w:tc>
+          <w:tcPr>
+            <w:tcW w:type="dxa" w:w="4874"/>
+          </w:tcPr>
+          <w:p>
+            <w:pPr>
+              <w:jc w:val="center"/>
+            </w:pPr>
+            <w:r/>
+            <w:r>
+              <w:drawing>
+                <wp:inline xmlns:a="http://schemas.openxmlformats.org/drawingml/2006/main" xmlns:pic="http://schemas.openxmlformats.org/drawingml/2006/picture">
+                  <wp:extent cx="2194560" cy="1645920"/>
+                  <wp:docPr id="7" name="Picture 7"/>
+                  <wp:cNvGraphicFramePr>
+                    <a:graphicFrameLocks noChangeAspect="1"/>
+                  </wp:cNvGraphicFramePr>
+                  <a:graphic>
+                    <a:graphicData uri="http://schemas.openxmlformats.org/drawingml/2006/picture">
+                      <pic:pic>
+                        <pic:nvPicPr>
+                          <pic:cNvPr id="0" name="JC-01_sampling_sediment_laden_stream.jpg"/>
+                          <pic:cNvPicPr/>
+                        </pic:nvPicPr>
+                        <pic:blipFill>
+                          <a:blip r:embed="rId16"/>
+                          <a:stretch>
+                            <a:fillRect/>
+                          </a:stretch>
+                        </pic:blipFill>
+                        <pic:spPr>
+                          <a:xfrm>
+                            <a:off x="0" y="0"/>
+                            <a:ext cx="2194560" cy="1645920"/>
+                          </a:xfrm>
+                          <a:prstGeom prst="rect"/>
+                        </pic:spPr>
+                      </pic:pic>
+                    </a:graphicData>
+                  </a:graphic>
+                </wp:inline>
+              </w:drawing>
+            </w:r>
+          </w:p>
+          <w:p>
+            <w:pPr>
+              <w:jc w:val="center"/>
+            </w:pPr>
+            <w:r>
+              <w:rPr>
+                <w:i/>
+                <w:sz w:val="17"/>
+              </w:rPr>
+              <w:t>Plate 5: JC group collecting a surface water sample from a reddish-brown, sediment-laden stream channel; iron-rich sediment blankets the bed and banks.</w:t>
+            </w:r>
+          </w:p>
+        </w:tc>
+        <w:tc>
+          <w:tcPr>
+            <w:tcW w:type="dxa" w:w="4874"/>
+          </w:tcPr>
+          <w:p>
+            <w:pPr>
+              <w:jc w:val="center"/>
+            </w:pPr>
+            <w:r/>
+            <w:r>
+              <w:drawing>
+                <wp:inline xmlns:a="http://schemas.openxmlformats.org/drawingml/2006/main" xmlns:pic="http://schemas.openxmlformats.org/drawingml/2006/picture">
+                  <wp:extent cx="2194560" cy="1645920"/>
+                  <wp:docPr id="8" name="Picture 8"/>
+                  <wp:cNvGraphicFramePr>
+                    <a:graphicFrameLocks noChangeAspect="1"/>
+                  </wp:cNvGraphicFramePr>
+                  <a:graphic>
+                    <a:graphicData uri="http://schemas.openxmlformats.org/drawingml/2006/picture">
+                      <pic:pic>
+                        <pic:nvPicPr>
+                          <pic:cNvPr id="0" name="JC-02_inspector_in_turbid_channel.jpg"/>
+                          <pic:cNvPicPr/>
+                        </pic:nvPicPr>
+                        <pic:blipFill>
+                          <a:blip r:embed="rId17"/>
+                          <a:stretch>
+                            <a:fillRect/>
+                          </a:stretch>
+                        </pic:blipFill>
+                        <pic:spPr>
+                          <a:xfrm>
+                            <a:off x="0" y="0"/>
+                            <a:ext cx="2194560" cy="1645920"/>
+                          </a:xfrm>
+                          <a:prstGeom prst="rect"/>
+                        </pic:spPr>
+                      </pic:pic>
+                    </a:graphicData>
+                  </a:graphic>
+                </wp:inline>
+              </w:drawing>
+            </w:r>
+          </w:p>
+          <w:p>
+            <w:pPr>
+              <w:jc w:val="center"/>
+            </w:pPr>
+            <w:r>
+              <w:rPr>
+                <w:i/>
+                <w:sz w:val="17"/>
+              </w:rPr>
+              <w:t>Plate 6: EPA inspector wading the turbid channel at a JC sampling point; dense riparian vegetation with sediment-coated understorey.</w:t>
+            </w:r>
+          </w:p>
+        </w:tc>
+      </w:tr>
+      <w:tr>
+        <w:tc>
+          <w:tcPr>
+            <w:tcW w:type="dxa" w:w="4874"/>
+          </w:tcPr>
+          <w:p>
+            <w:pPr>
+              <w:jc w:val="center"/>
+            </w:pPr>
+            <w:r/>
+            <w:r>
+              <w:drawing>
+                <wp:inline xmlns:a="http://schemas.openxmlformats.org/drawingml/2006/main" xmlns:pic="http://schemas.openxmlformats.org/drawingml/2006/picture">
+                  <wp:extent cx="2194560" cy="1645920"/>
+                  <wp:docPr id="9" name="Picture 9"/>
+                  <wp:cNvGraphicFramePr>
+                    <a:graphicFrameLocks noChangeAspect="1"/>
+                  </wp:cNvGraphicFramePr>
+                  <a:graphic>
+                    <a:graphicData uri="http://schemas.openxmlformats.org/drawingml/2006/picture">
+                      <pic:pic>
+                        <pic:nvPicPr>
+                          <pic:cNvPr id="0" name="JC-03_reddish_brown_stream_channel.jpg"/>
+                          <pic:cNvPicPr/>
+                        </pic:nvPicPr>
+                        <pic:blipFill>
+                          <a:blip r:embed="rId18"/>
+                          <a:stretch>
+                            <a:fillRect/>
+                          </a:stretch>
+                        </pic:blipFill>
+                        <pic:spPr>
+                          <a:xfrm>
+                            <a:off x="0" y="0"/>
+                            <a:ext cx="2194560" cy="1645920"/>
+                          </a:xfrm>
+                          <a:prstGeom prst="rect"/>
+                        </pic:spPr>
+                      </pic:pic>
+                    </a:graphicData>
+                  </a:graphic>
+                </wp:inline>
+              </w:drawing>
+            </w:r>
+          </w:p>
+          <w:p>
+            <w:pPr>
+              <w:jc w:val="center"/>
+            </w:pPr>
+            <w:r>
+              <w:rPr>
+                <w:i/>
+                <w:sz w:val="17"/>
+              </w:rPr>
+              <w:t>Plate 7: Reddish-brown, visibly turbid flow in a JC group stream, with sediment deposition along the channel margins.</w:t>
+            </w:r>
+          </w:p>
+        </w:tc>
+        <w:tc>
+          <w:tcPr>
+            <w:tcW w:type="dxa" w:w="4874"/>
+          </w:tcPr>
+          <w:p>
+            <w:pPr>
+              <w:jc w:val="center"/>
+            </w:pPr>
+            <w:r/>
+            <w:r>
+              <w:drawing>
+                <wp:inline xmlns:a="http://schemas.openxmlformats.org/drawingml/2006/main" xmlns:pic="http://schemas.openxmlformats.org/drawingml/2006/picture">
+                  <wp:extent cx="2194560" cy="1645920"/>
+                  <wp:docPr id="10" name="Picture 10"/>
+                  <wp:cNvGraphicFramePr>
+                    <a:graphicFrameLocks noChangeAspect="1"/>
+                  </wp:cNvGraphicFramePr>
+                  <a:graphic>
+                    <a:graphicData uri="http://schemas.openxmlformats.org/drawingml/2006/picture">
+                      <pic:pic>
+                        <pic:nvPicPr>
+                          <pic:cNvPr id="0" name="JC-04_sediment_inundated_lowland.jpg"/>
+                          <pic:cNvPicPr/>
+                        </pic:nvPicPr>
+                        <pic:blipFill>
+                          <a:blip r:embed="rId19"/>
+                          <a:stretch>
+                            <a:fillRect/>
+                          </a:stretch>
+                        </pic:blipFill>
+                        <pic:spPr>
+                          <a:xfrm>
+                            <a:off x="0" y="0"/>
+                            <a:ext cx="2194560" cy="1645920"/>
+                          </a:xfrm>
+                          <a:prstGeom prst="rect"/>
+                        </pic:spPr>
+                      </pic:pic>
+                    </a:graphicData>
+                  </a:graphic>
+                </wp:inline>
+              </w:drawing>
+            </w:r>
+          </w:p>
+          <w:p>
+            <w:pPr>
+              <w:jc w:val="center"/>
+            </w:pPr>
+            <w:r>
+              <w:rPr>
+                <w:i/>
+                <w:sz w:val="17"/>
+              </w:rPr>
+              <w:t>Plate 8: Low-lying land inundated by sediment-laden water, with mine-derived sediment deposited over the ground surface and vegetation.</w:t>
+            </w:r>
+          </w:p>
+        </w:tc>
+      </w:tr>
+    </w:tbl>
+    <w:p/>
+    <w:p>
       <w:pPr>
         <w:spacing w:after="120"/>
       </w:pPr>
@@ -7035,7 +7053,7 @@
           <w:i/>
           <w:color w:val="7F7F7F"/>
         </w:rPr>
-        <w:t>[To be added: Photographs from the ES and JC groups and from the community consultation.]</w:t>
+        <w:t>[To be added: Photographs from the ES group and from the community consultation; confirmation by the JC group of the sampling point shown in each of Plates 5–8.]</w:t>
       </w:r>
     </w:p>
     <w:p>

</xml_diff>

<commit_message>
Follow-up report: add List of Abbreviations; name JC (Joseph Charles) and Social Team (Rafael S. Ngumbu) leads
Co-authored-by: arena-agent <297053741+arena-agent@users.noreply.github.com>
</commit_message>
<xml_diff>
--- a/bolo-town/Bolo Town Follow-up Investigative Assessment Report (Oct 13 2026) - DRAFT.docx
+++ b/bolo-town/Bolo Town Follow-up Investigative Assessment Report (Oct 13 2026) - DRAFT.docx
@@ -633,6 +633,817 @@
     </w:p>
     <w:p>
       <w:pPr>
+        <w:spacing w:after="160"/>
+        <w:shd w:val="clear" w:color="auto" w:fill="4F81BD"/>
+      </w:pPr>
+      <w:r>
+        <w:rPr>
+          <w:b/>
+          <w:color w:val="FFFFFF"/>
+          <w:sz w:val="24"/>
+        </w:rPr>
+        <w:t>LIST OF ABBREVIATIONS</w:t>
+      </w:r>
+    </w:p>
+    <w:tbl>
+      <w:tblPr>
+        <w:tblStyle w:val="TableGrid"/>
+        <w:tblW w:type="auto" w:w="0"/>
+        <w:jc w:val="center"/>
+        <w:tblLook w:firstColumn="1" w:firstRow="1" w:lastColumn="0" w:lastRow="0" w:noHBand="0" w:noVBand="1" w:val="04A0"/>
+      </w:tblPr>
+      <w:tblGrid>
+        <w:gridCol w:w="4874"/>
+        <w:gridCol w:w="4874"/>
+      </w:tblGrid>
+      <w:tr>
+        <w:tc>
+          <w:tcPr>
+            <w:tcW w:type="dxa" w:w="2160"/>
+            <w:shd w:val="clear" w:color="auto" w:fill="404040"/>
+          </w:tcPr>
+          <w:p>
+            <w:r/>
+            <w:r>
+              <w:rPr>
+                <w:b/>
+                <w:color w:val="FFFFFF"/>
+                <w:sz w:val="20"/>
+              </w:rPr>
+              <w:t>Abbreviation</w:t>
+            </w:r>
+          </w:p>
+        </w:tc>
+        <w:tc>
+          <w:tcPr>
+            <w:tcW w:type="dxa" w:w="7488"/>
+            <w:shd w:val="clear" w:color="auto" w:fill="404040"/>
+          </w:tcPr>
+          <w:p>
+            <w:r/>
+            <w:r>
+              <w:rPr>
+                <w:b/>
+                <w:color w:val="FFFFFF"/>
+                <w:sz w:val="20"/>
+              </w:rPr>
+              <w:t>Meaning</w:t>
+            </w:r>
+          </w:p>
+        </w:tc>
+      </w:tr>
+      <w:tr>
+        <w:tc>
+          <w:tcPr>
+            <w:tcW w:type="dxa" w:w="2160"/>
+          </w:tcPr>
+          <w:p>
+            <w:r/>
+            <w:r>
+              <w:rPr>
+                <w:b/>
+                <w:sz w:val="20"/>
+              </w:rPr>
+              <w:t>AF</w:t>
+            </w:r>
+          </w:p>
+        </w:tc>
+        <w:tc>
+          <w:tcPr>
+            <w:tcW w:type="dxa" w:w="7488"/>
+          </w:tcPr>
+          <w:p>
+            <w:r/>
+            <w:r>
+              <w:rPr>
+                <w:sz w:val="20"/>
+              </w:rPr>
+              <w:t>Alphonso Farm (sample code prefix)</w:t>
+            </w:r>
+          </w:p>
+        </w:tc>
+      </w:tr>
+      <w:tr>
+        <w:tc>
+          <w:tcPr>
+            <w:tcW w:type="dxa" w:w="2160"/>
+          </w:tcPr>
+          <w:p>
+            <w:r/>
+            <w:r>
+              <w:rPr>
+                <w:b/>
+                <w:sz w:val="20"/>
+              </w:rPr>
+              <w:t>AML</w:t>
+            </w:r>
+          </w:p>
+        </w:tc>
+        <w:tc>
+          <w:tcPr>
+            <w:tcW w:type="dxa" w:w="7488"/>
+          </w:tcPr>
+          <w:p>
+            <w:r/>
+            <w:r>
+              <w:rPr>
+                <w:sz w:val="20"/>
+              </w:rPr>
+              <w:t>ArcelorMittal Liberia Limited</w:t>
+            </w:r>
+          </w:p>
+        </w:tc>
+      </w:tr>
+      <w:tr>
+        <w:tc>
+          <w:tcPr>
+            <w:tcW w:type="dxa" w:w="2160"/>
+          </w:tcPr>
+          <w:p>
+            <w:r/>
+            <w:r>
+              <w:rPr>
+                <w:b/>
+                <w:sz w:val="20"/>
+              </w:rPr>
+              <w:t>DS / MS / US</w:t>
+            </w:r>
+          </w:p>
+        </w:tc>
+        <w:tc>
+          <w:tcPr>
+            <w:tcW w:type="dxa" w:w="7488"/>
+          </w:tcPr>
+          <w:p>
+            <w:r/>
+            <w:r>
+              <w:rPr>
+                <w:sz w:val="20"/>
+              </w:rPr>
+              <w:t>Downstream / Mid-stream / Upstream (sampling station)</w:t>
+            </w:r>
+          </w:p>
+        </w:tc>
+      </w:tr>
+      <w:tr>
+        <w:tc>
+          <w:tcPr>
+            <w:tcW w:type="dxa" w:w="2160"/>
+          </w:tcPr>
+          <w:p>
+            <w:r/>
+            <w:r>
+              <w:rPr>
+                <w:b/>
+                <w:sz w:val="20"/>
+              </w:rPr>
+              <w:t>EPA</w:t>
+            </w:r>
+          </w:p>
+        </w:tc>
+        <w:tc>
+          <w:tcPr>
+            <w:tcW w:type="dxa" w:w="7488"/>
+          </w:tcPr>
+          <w:p>
+            <w:r/>
+            <w:r>
+              <w:rPr>
+                <w:sz w:val="20"/>
+              </w:rPr>
+              <w:t>Environmental Protection Agency of Liberia</w:t>
+            </w:r>
+          </w:p>
+        </w:tc>
+      </w:tr>
+      <w:tr>
+        <w:tc>
+          <w:tcPr>
+            <w:tcW w:type="dxa" w:w="2160"/>
+          </w:tcPr>
+          <w:p>
+            <w:r/>
+            <w:r>
+              <w:rPr>
+                <w:b/>
+                <w:sz w:val="20"/>
+              </w:rPr>
+              <w:t>ES</w:t>
+            </w:r>
+          </w:p>
+        </w:tc>
+        <w:tc>
+          <w:tcPr>
+            <w:tcW w:type="dxa" w:w="7488"/>
+          </w:tcPr>
+          <w:p>
+            <w:r/>
+            <w:r>
+              <w:rPr>
+                <w:sz w:val="20"/>
+              </w:rPr>
+              <w:t>Emmanuel Suah group (Group 1 – Yeewa, Yeewa Korweny 1 &amp; 2); sample code suffix</w:t>
+            </w:r>
+          </w:p>
+        </w:tc>
+      </w:tr>
+      <w:tr>
+        <w:tc>
+          <w:tcPr>
+            <w:tcW w:type="dxa" w:w="2160"/>
+          </w:tcPr>
+          <w:p>
+            <w:r/>
+            <w:r>
+              <w:rPr>
+                <w:b/>
+                <w:sz w:val="20"/>
+              </w:rPr>
+              <w:t>GPS</w:t>
+            </w:r>
+          </w:p>
+        </w:tc>
+        <w:tc>
+          <w:tcPr>
+            <w:tcW w:type="dxa" w:w="7488"/>
+          </w:tcPr>
+          <w:p>
+            <w:r/>
+            <w:r>
+              <w:rPr>
+                <w:sz w:val="20"/>
+              </w:rPr>
+              <w:t>Global Positioning System</w:t>
+            </w:r>
+          </w:p>
+        </w:tc>
+      </w:tr>
+      <w:tr>
+        <w:tc>
+          <w:tcPr>
+            <w:tcW w:type="dxa" w:w="2160"/>
+          </w:tcPr>
+          <w:p>
+            <w:r/>
+            <w:r>
+              <w:rPr>
+                <w:b/>
+                <w:sz w:val="20"/>
+              </w:rPr>
+              <w:t>JC</w:t>
+            </w:r>
+          </w:p>
+        </w:tc>
+        <w:tc>
+          <w:tcPr>
+            <w:tcW w:type="dxa" w:w="7488"/>
+          </w:tcPr>
+          <w:p>
+            <w:r/>
+            <w:r>
+              <w:rPr>
+                <w:sz w:val="20"/>
+              </w:rPr>
+              <w:t>Joseph Charles group (Group 3 – Wenee, Saymenee, Alphonso farm, Neneyee); sample code suffix</w:t>
+            </w:r>
+          </w:p>
+        </w:tc>
+      </w:tr>
+      <w:tr>
+        <w:tc>
+          <w:tcPr>
+            <w:tcW w:type="dxa" w:w="2160"/>
+          </w:tcPr>
+          <w:p>
+            <w:r/>
+            <w:r>
+              <w:rPr>
+                <w:b/>
+                <w:sz w:val="20"/>
+              </w:rPr>
+              <w:t>LRA</w:t>
+            </w:r>
+          </w:p>
+        </w:tc>
+        <w:tc>
+          <w:tcPr>
+            <w:tcW w:type="dxa" w:w="7488"/>
+          </w:tcPr>
+          <w:p>
+            <w:r/>
+            <w:r>
+              <w:rPr>
+                <w:sz w:val="20"/>
+              </w:rPr>
+              <w:t>Liberia Revenue Authority</w:t>
+            </w:r>
+          </w:p>
+        </w:tc>
+      </w:tr>
+      <w:tr>
+        <w:tc>
+          <w:tcPr>
+            <w:tcW w:type="dxa" w:w="2160"/>
+          </w:tcPr>
+          <w:p>
+            <w:r/>
+            <w:r>
+              <w:rPr>
+                <w:b/>
+                <w:sz w:val="20"/>
+              </w:rPr>
+              <w:t>LWQS</w:t>
+            </w:r>
+          </w:p>
+        </w:tc>
+        <w:tc>
+          <w:tcPr>
+            <w:tcW w:type="dxa" w:w="7488"/>
+          </w:tcPr>
+          <w:p>
+            <w:r/>
+            <w:r>
+              <w:rPr>
+                <w:sz w:val="20"/>
+              </w:rPr>
+              <w:t>Liberian Water Quality Standards</w:t>
+            </w:r>
+          </w:p>
+        </w:tc>
+      </w:tr>
+      <w:tr>
+        <w:tc>
+          <w:tcPr>
+            <w:tcW w:type="dxa" w:w="2160"/>
+          </w:tcPr>
+          <w:p>
+            <w:r/>
+            <w:r>
+              <w:rPr>
+                <w:b/>
+                <w:sz w:val="20"/>
+              </w:rPr>
+              <w:t>mg/L</w:t>
+            </w:r>
+          </w:p>
+        </w:tc>
+        <w:tc>
+          <w:tcPr>
+            <w:tcW w:type="dxa" w:w="7488"/>
+          </w:tcPr>
+          <w:p>
+            <w:r/>
+            <w:r>
+              <w:rPr>
+                <w:sz w:val="20"/>
+              </w:rPr>
+              <w:t>Milligrams per litre</w:t>
+            </w:r>
+          </w:p>
+        </w:tc>
+      </w:tr>
+      <w:tr>
+        <w:tc>
+          <w:tcPr>
+            <w:tcW w:type="dxa" w:w="2160"/>
+          </w:tcPr>
+          <w:p>
+            <w:r/>
+            <w:r>
+              <w:rPr>
+                <w:b/>
+                <w:sz w:val="20"/>
+              </w:rPr>
+              <w:t>NEN</w:t>
+            </w:r>
+          </w:p>
+        </w:tc>
+        <w:tc>
+          <w:tcPr>
+            <w:tcW w:type="dxa" w:w="7488"/>
+          </w:tcPr>
+          <w:p>
+            <w:r/>
+            <w:r>
+              <w:rPr>
+                <w:sz w:val="20"/>
+              </w:rPr>
+              <w:t>Neneyee (sample code prefix)</w:t>
+            </w:r>
+          </w:p>
+        </w:tc>
+      </w:tr>
+      <w:tr>
+        <w:tc>
+          <w:tcPr>
+            <w:tcW w:type="dxa" w:w="2160"/>
+          </w:tcPr>
+          <w:p>
+            <w:r/>
+            <w:r>
+              <w:rPr>
+                <w:b/>
+                <w:sz w:val="20"/>
+              </w:rPr>
+              <w:t>POM</w:t>
+            </w:r>
+          </w:p>
+        </w:tc>
+        <w:tc>
+          <w:tcPr>
+            <w:tcW w:type="dxa" w:w="7488"/>
+          </w:tcPr>
+          <w:p>
+            <w:r/>
+            <w:r>
+              <w:rPr>
+                <w:sz w:val="20"/>
+              </w:rPr>
+              <w:t>Pompleh (sample code prefix)</w:t>
+            </w:r>
+          </w:p>
+        </w:tc>
+      </w:tr>
+      <w:tr>
+        <w:tc>
+          <w:tcPr>
+            <w:tcW w:type="dxa" w:w="2160"/>
+          </w:tcPr>
+          <w:p>
+            <w:r/>
+            <w:r>
+              <w:rPr>
+                <w:b/>
+                <w:sz w:val="20"/>
+              </w:rPr>
+              <w:t>QA/QC</w:t>
+            </w:r>
+          </w:p>
+        </w:tc>
+        <w:tc>
+          <w:tcPr>
+            <w:tcW w:type="dxa" w:w="7488"/>
+          </w:tcPr>
+          <w:p>
+            <w:r/>
+            <w:r>
+              <w:rPr>
+                <w:sz w:val="20"/>
+              </w:rPr>
+              <w:t>Quality Assurance / Quality Control</w:t>
+            </w:r>
+          </w:p>
+        </w:tc>
+      </w:tr>
+      <w:tr>
+        <w:tc>
+          <w:tcPr>
+            <w:tcW w:type="dxa" w:w="2160"/>
+          </w:tcPr>
+          <w:p>
+            <w:r/>
+            <w:r>
+              <w:rPr>
+                <w:b/>
+                <w:sz w:val="20"/>
+              </w:rPr>
+              <w:t>RAP</w:t>
+            </w:r>
+          </w:p>
+        </w:tc>
+        <w:tc>
+          <w:tcPr>
+            <w:tcW w:type="dxa" w:w="7488"/>
+          </w:tcPr>
+          <w:p>
+            <w:r/>
+            <w:r>
+              <w:rPr>
+                <w:sz w:val="20"/>
+              </w:rPr>
+              <w:t>Resettlement Action Plan</w:t>
+            </w:r>
+          </w:p>
+        </w:tc>
+      </w:tr>
+      <w:tr>
+        <w:tc>
+          <w:tcPr>
+            <w:tcW w:type="dxa" w:w="2160"/>
+          </w:tcPr>
+          <w:p>
+            <w:r/>
+            <w:r>
+              <w:rPr>
+                <w:b/>
+                <w:sz w:val="20"/>
+              </w:rPr>
+              <w:t>SM</w:t>
+            </w:r>
+          </w:p>
+        </w:tc>
+        <w:tc>
+          <w:tcPr>
+            <w:tcW w:type="dxa" w:w="7488"/>
+          </w:tcPr>
+          <w:p>
+            <w:r/>
+            <w:r>
+              <w:rPr>
+                <w:sz w:val="20"/>
+              </w:rPr>
+              <w:t>Saymenee (sample code prefix)</w:t>
+            </w:r>
+          </w:p>
+        </w:tc>
+      </w:tr>
+      <w:tr>
+        <w:tc>
+          <w:tcPr>
+            <w:tcW w:type="dxa" w:w="2160"/>
+          </w:tcPr>
+          <w:p>
+            <w:r/>
+            <w:r>
+              <w:rPr>
+                <w:b/>
+                <w:sz w:val="20"/>
+              </w:rPr>
+              <w:t>SW</w:t>
+            </w:r>
+          </w:p>
+        </w:tc>
+        <w:tc>
+          <w:tcPr>
+            <w:tcW w:type="dxa" w:w="7488"/>
+          </w:tcPr>
+          <w:p>
+            <w:r/>
+            <w:r>
+              <w:rPr>
+                <w:sz w:val="20"/>
+              </w:rPr>
+              <w:t>Surface Water (sample matrix)</w:t>
+            </w:r>
+          </w:p>
+        </w:tc>
+      </w:tr>
+      <w:tr>
+        <w:tc>
+          <w:tcPr>
+            <w:tcW w:type="dxa" w:w="2160"/>
+          </w:tcPr>
+          <w:p>
+            <w:r/>
+            <w:r>
+              <w:rPr>
+                <w:b/>
+                <w:sz w:val="20"/>
+              </w:rPr>
+              <w:t>TDS</w:t>
+            </w:r>
+          </w:p>
+        </w:tc>
+        <w:tc>
+          <w:tcPr>
+            <w:tcW w:type="dxa" w:w="7488"/>
+          </w:tcPr>
+          <w:p>
+            <w:r/>
+            <w:r>
+              <w:rPr>
+                <w:sz w:val="20"/>
+              </w:rPr>
+              <w:t>Total Dissolved Solids</w:t>
+            </w:r>
+          </w:p>
+        </w:tc>
+      </w:tr>
+      <w:tr>
+        <w:tc>
+          <w:tcPr>
+            <w:tcW w:type="dxa" w:w="2160"/>
+          </w:tcPr>
+          <w:p>
+            <w:r/>
+            <w:r>
+              <w:rPr>
+                <w:b/>
+                <w:sz w:val="20"/>
+              </w:rPr>
+              <w:t>TSS</w:t>
+            </w:r>
+          </w:p>
+        </w:tc>
+        <w:tc>
+          <w:tcPr>
+            <w:tcW w:type="dxa" w:w="7488"/>
+          </w:tcPr>
+          <w:p>
+            <w:r/>
+            <w:r>
+              <w:rPr>
+                <w:sz w:val="20"/>
+              </w:rPr>
+              <w:t>Total Suspended Solids</w:t>
+            </w:r>
+          </w:p>
+        </w:tc>
+      </w:tr>
+      <w:tr>
+        <w:tc>
+          <w:tcPr>
+            <w:tcW w:type="dxa" w:w="2160"/>
+          </w:tcPr>
+          <w:p>
+            <w:r/>
+            <w:r>
+              <w:rPr>
+                <w:b/>
+                <w:sz w:val="20"/>
+              </w:rPr>
+              <w:t>VA</w:t>
+            </w:r>
+          </w:p>
+        </w:tc>
+        <w:tc>
+          <w:tcPr>
+            <w:tcW w:type="dxa" w:w="7488"/>
+          </w:tcPr>
+          <w:p>
+            <w:r/>
+            <w:r>
+              <w:rPr>
+                <w:sz w:val="20"/>
+              </w:rPr>
+              <w:t>Varney Armah group (Group 2 – Wehyee and Pompleh); sample code suffix</w:t>
+            </w:r>
+          </w:p>
+        </w:tc>
+      </w:tr>
+      <w:tr>
+        <w:tc>
+          <w:tcPr>
+            <w:tcW w:type="dxa" w:w="2160"/>
+          </w:tcPr>
+          <w:p>
+            <w:r/>
+            <w:r>
+              <w:rPr>
+                <w:b/>
+                <w:sz w:val="20"/>
+              </w:rPr>
+              <w:t>W</w:t>
+            </w:r>
+          </w:p>
+        </w:tc>
+        <w:tc>
+          <w:tcPr>
+            <w:tcW w:type="dxa" w:w="7488"/>
+          </w:tcPr>
+          <w:p>
+            <w:r/>
+            <w:r>
+              <w:rPr>
+                <w:sz w:val="20"/>
+              </w:rPr>
+              <w:t>Wehyee (sample code prefix)</w:t>
+            </w:r>
+          </w:p>
+        </w:tc>
+      </w:tr>
+      <w:tr>
+        <w:tc>
+          <w:tcPr>
+            <w:tcW w:type="dxa" w:w="2160"/>
+          </w:tcPr>
+          <w:p>
+            <w:r/>
+            <w:r>
+              <w:rPr>
+                <w:b/>
+                <w:sz w:val="20"/>
+              </w:rPr>
+              <w:t>WE</w:t>
+            </w:r>
+          </w:p>
+        </w:tc>
+        <w:tc>
+          <w:tcPr>
+            <w:tcW w:type="dxa" w:w="7488"/>
+          </w:tcPr>
+          <w:p>
+            <w:r/>
+            <w:r>
+              <w:rPr>
+                <w:sz w:val="20"/>
+              </w:rPr>
+              <w:t>Wenee (sample code prefix)</w:t>
+            </w:r>
+          </w:p>
+        </w:tc>
+      </w:tr>
+      <w:tr>
+        <w:tc>
+          <w:tcPr>
+            <w:tcW w:type="dxa" w:w="2160"/>
+          </w:tcPr>
+          <w:p>
+            <w:r/>
+            <w:r>
+              <w:rPr>
+                <w:b/>
+                <w:sz w:val="20"/>
+              </w:rPr>
+              <w:t>YEEWA</w:t>
+            </w:r>
+          </w:p>
+        </w:tc>
+        <w:tc>
+          <w:tcPr>
+            <w:tcW w:type="dxa" w:w="7488"/>
+          </w:tcPr>
+          <w:p>
+            <w:r/>
+            <w:r>
+              <w:rPr>
+                <w:sz w:val="20"/>
+              </w:rPr>
+              <w:t>Yeewa main stream (sample code prefix)</w:t>
+            </w:r>
+          </w:p>
+        </w:tc>
+      </w:tr>
+      <w:tr>
+        <w:tc>
+          <w:tcPr>
+            <w:tcW w:type="dxa" w:w="2160"/>
+          </w:tcPr>
+          <w:p>
+            <w:r/>
+            <w:r>
+              <w:rPr>
+                <w:b/>
+                <w:sz w:val="20"/>
+              </w:rPr>
+              <w:t>YWK1</w:t>
+            </w:r>
+          </w:p>
+        </w:tc>
+        <w:tc>
+          <w:tcPr>
+            <w:tcW w:type="dxa" w:w="7488"/>
+          </w:tcPr>
+          <w:p>
+            <w:r/>
+            <w:r>
+              <w:rPr>
+                <w:sz w:val="20"/>
+              </w:rPr>
+              <w:t>Yeewa Korweny 1 – Dor tributary (sample code prefix)</w:t>
+            </w:r>
+          </w:p>
+        </w:tc>
+      </w:tr>
+      <w:tr>
+        <w:tc>
+          <w:tcPr>
+            <w:tcW w:type="dxa" w:w="2160"/>
+          </w:tcPr>
+          <w:p>
+            <w:r/>
+            <w:r>
+              <w:rPr>
+                <w:b/>
+                <w:sz w:val="20"/>
+              </w:rPr>
+              <w:t>YWK2</w:t>
+            </w:r>
+          </w:p>
+        </w:tc>
+        <w:tc>
+          <w:tcPr>
+            <w:tcW w:type="dxa" w:w="7488"/>
+          </w:tcPr>
+          <w:p>
+            <w:r/>
+            <w:r>
+              <w:rPr>
+                <w:sz w:val="20"/>
+              </w:rPr>
+              <w:t>Yeewa Korweny 2 – Patel tributary (sample code prefix)</w:t>
+            </w:r>
+          </w:p>
+        </w:tc>
+      </w:tr>
+    </w:tbl>
+    <w:p>
+      <w:r>
+        <w:br w:type="page"/>
+      </w:r>
+    </w:p>
+    <w:p>
+      <w:pPr>
         <w:pStyle w:val="Heading1"/>
         <w:spacing w:before="280" w:after="120"/>
         <w:shd w:val="clear" w:color="auto" w:fill="4F81BD"/>
@@ -1186,7 +1997,7 @@
         <w:jc w:val="both"/>
       </w:pPr>
       <w:r>
-        <w:t>The EPA team was divided into four groups to facilitate the technical and social components of the assessment.</w:t>
+        <w:t>The EPA team, led by Director Rafael S. Ngumbu, was divided into four groups to facilitate the technical and social components of the assessment: three environmental sampling and field assessment groups headed by Emmanuel Suah (ES), Varney Armah (VA) and Joseph Charles (JC), and a Social Team headed by Mr. Ngumbu.</w:t>
       </w:r>
     </w:p>
     <w:p>
@@ -1309,7 +2120,15 @@
           <w:tcPr>
             <w:tcW w:type="dxa" w:w="4248"/>
           </w:tcPr>
-          <w:p/>
+          <w:p>
+            <w:r/>
+            <w:r>
+              <w:rPr>
+                <w:sz w:val="18"/>
+              </w:rPr>
+              <w:t>Environmental sampling and field assessment – Yeewa main stream, Yeewa Korweny 1 (Dor) and Yeewa Korweny 2 (Patel).</w:t>
+            </w:r>
+          </w:p>
         </w:tc>
       </w:tr>
       <w:tr>
@@ -1367,7 +2186,15 @@
           <w:tcPr>
             <w:tcW w:type="dxa" w:w="3312"/>
           </w:tcPr>
-          <w:p/>
+          <w:p>
+            <w:r/>
+            <w:r>
+              <w:rPr>
+                <w:sz w:val="18"/>
+              </w:rPr>
+              <w:t>Joseph Charles</w:t>
+            </w:r>
+          </w:p>
         </w:tc>
         <w:tc>
           <w:tcPr>
@@ -1409,7 +2236,7 @@
               <w:rPr>
                 <w:sz w:val="18"/>
               </w:rPr>
-              <w:t>[Lead to be confirmed]</w:t>
+              <w:t>Rafael S. Ngumbu (EPA Team Lead)</w:t>
             </w:r>
           </w:p>
         </w:tc>
@@ -1417,7 +2244,15 @@
           <w:tcPr>
             <w:tcW w:type="dxa" w:w="4248"/>
           </w:tcPr>
-          <w:p/>
+          <w:p>
+            <w:r/>
+            <w:r>
+              <w:rPr>
+                <w:sz w:val="18"/>
+              </w:rPr>
+              <w:t>Engagement of Bolo Town leadership and residents on farm damage, access, compensation and the farm-damage survey process.</w:t>
+            </w:r>
+          </w:p>
         </w:tc>
       </w:tr>
     </w:tbl>
@@ -2479,7 +3314,20 @@
             <w:tcW w:type="dxa" w:w="1066"/>
             <w:shd w:val="clear" w:color="auto" w:fill="404040"/>
           </w:tcPr>
-          <w:p/>
+          <w:p>
+            <w:pPr>
+              <w:jc w:val="center"/>
+            </w:pPr>
+            <w:r/>
+            <w:r>
+              <w:rPr>
+                <w:b/>
+                <w:color w:val="FFFFFF"/>
+                <w:sz w:val="15"/>
+              </w:rPr>
+              <w:t>Longitude</w:t>
+            </w:r>
+          </w:p>
         </w:tc>
         <w:tc>
           <w:tcPr>
@@ -2583,6 +3431,96 @@
           <w:tcPr>
             <w:tcW w:type="dxa" w:w="3600"/>
           </w:tcPr>
+          <w:p/>
+        </w:tc>
+      </w:tr>
+      <w:tr>
+        <w:tc>
+          <w:tcPr>
+            <w:tcW w:type="dxa" w:w="1656"/>
+          </w:tcPr>
+          <w:p>
+            <w:r/>
+            <w:r>
+              <w:rPr>
+                <w:sz w:val="15"/>
+              </w:rPr>
+              <w:t>Wenee mid-point</w:t>
+            </w:r>
+          </w:p>
+        </w:tc>
+        <w:tc>
+          <w:tcPr>
+            <w:tcW w:type="dxa" w:w="1555"/>
+          </w:tcPr>
+          <w:p>
+            <w:pPr>
+              <w:jc w:val="center"/>
+            </w:pPr>
+            <w:r/>
+            <w:r>
+              <w:rPr>
+                <w:sz w:val="15"/>
+              </w:rPr>
+              <w:t>WE-JC-SW-002</w:t>
+            </w:r>
+          </w:p>
+        </w:tc>
+        <w:tc>
+          <w:tcPr>
+            <w:tcW w:type="dxa" w:w="979"/>
+          </w:tcPr>
+          <w:p>
+            <w:pPr>
+              <w:jc w:val="center"/>
+            </w:pPr>
+            <w:r/>
+            <w:r>
+              <w:rPr>
+                <w:sz w:val="15"/>
+              </w:rPr>
+              <w:t>0542460</w:t>
+            </w:r>
+          </w:p>
+        </w:tc>
+        <w:tc>
+          <w:tcPr>
+            <w:tcW w:type="dxa" w:w="1066"/>
+          </w:tcPr>
+          <w:p>
+            <w:pPr>
+              <w:jc w:val="center"/>
+            </w:pPr>
+            <w:r/>
+            <w:r>
+              <w:rPr>
+                <w:sz w:val="15"/>
+              </w:rPr>
+              <w:t>0834664</w:t>
+            </w:r>
+          </w:p>
+        </w:tc>
+        <w:tc>
+          <w:tcPr>
+            <w:tcW w:type="dxa" w:w="893"/>
+          </w:tcPr>
+          <w:p>
+            <w:pPr>
+              <w:jc w:val="center"/>
+            </w:pPr>
+            <w:r/>
+            <w:r>
+              <w:rPr>
+                <w:sz w:val="15"/>
+              </w:rPr>
+              <w:t>2:21 PM</w:t>
+            </w:r>
+          </w:p>
+        </w:tc>
+        <w:tc>
+          <w:tcPr>
+            <w:tcW w:type="dxa" w:w="3600"/>
+          </w:tcPr>
           <w:p>
             <w:pPr>
               <w:jc w:val="center"/>
@@ -2608,19 +3546,13 @@
               <w:rPr>
                 <w:sz w:val="15"/>
               </w:rPr>
-              <w:t>Wenee mid-point</w:t>
+              <w:t>Wenee Upstream (confluence with Saymenee)</w:t>
             </w:r>
           </w:p>
         </w:tc>
         <w:tc>
           <w:tcPr>
             <w:tcW w:type="dxa" w:w="1555"/>
-          </w:tcPr>
-          <w:p/>
-        </w:tc>
-        <w:tc>
-          <w:tcPr>
-            <w:tcW w:type="dxa" w:w="979"/>
           </w:tcPr>
           <w:p>
             <w:pPr>
@@ -2631,13 +3563,13 @@
               <w:rPr>
                 <w:sz w:val="15"/>
               </w:rPr>
-              <w:t>0542460</w:t>
+              <w:t>WE-SW-JC-003</w:t>
             </w:r>
           </w:p>
         </w:tc>
         <w:tc>
           <w:tcPr>
-            <w:tcW w:type="dxa" w:w="1066"/>
+            <w:tcW w:type="dxa" w:w="979"/>
           </w:tcPr>
           <w:p>
             <w:pPr>
@@ -2648,9 +3580,15 @@
               <w:rPr>
                 <w:sz w:val="15"/>
               </w:rPr>
-              <w:t>0834664</w:t>
+              <w:t>0542353</w:t>
             </w:r>
           </w:p>
+        </w:tc>
+        <w:tc>
+          <w:tcPr>
+            <w:tcW w:type="dxa" w:w="1066"/>
+          </w:tcPr>
+          <w:p/>
         </w:tc>
         <w:tc>
           <w:tcPr>
@@ -2665,7 +3603,7 @@
               <w:rPr>
                 <w:sz w:val="15"/>
               </w:rPr>
-              <w:t>2:21 PM</w:t>
+              <w:t>2:36 PM</w:t>
             </w:r>
           </w:p>
         </w:tc>
@@ -2692,7 +3630,15 @@
           <w:tcPr>
             <w:tcW w:type="dxa" w:w="1656"/>
           </w:tcPr>
-          <w:p/>
+          <w:p>
+            <w:r/>
+            <w:r>
+              <w:rPr>
+                <w:sz w:val="15"/>
+              </w:rPr>
+              <w:t>Saymenee mid-point</w:t>
+            </w:r>
+          </w:p>
         </w:tc>
         <w:tc>
           <w:tcPr>
@@ -2713,7 +3659,7 @@
               <w:rPr>
                 <w:sz w:val="15"/>
               </w:rPr>
-              <w:t>0542353</w:t>
+              <w:t>0542304</w:t>
             </w:r>
           </w:p>
         </w:tc>
@@ -2726,46 +3672,6 @@
         <w:tc>
           <w:tcPr>
             <w:tcW w:type="dxa" w:w="893"/>
-          </w:tcPr>
-          <w:p/>
-        </w:tc>
-        <w:tc>
-          <w:tcPr>
-            <w:tcW w:type="dxa" w:w="3600"/>
-          </w:tcPr>
-          <w:p/>
-        </w:tc>
-      </w:tr>
-      <w:tr>
-        <w:tc>
-          <w:tcPr>
-            <w:tcW w:type="dxa" w:w="1656"/>
-          </w:tcPr>
-          <w:p>
-            <w:r/>
-            <w:r>
-              <w:rPr>
-                <w:sz w:val="15"/>
-              </w:rPr>
-              <w:t>Saymenee mid-point</w:t>
-            </w:r>
-          </w:p>
-        </w:tc>
-        <w:tc>
-          <w:tcPr>
-            <w:tcW w:type="dxa" w:w="1555"/>
-          </w:tcPr>
-          <w:p/>
-        </w:tc>
-        <w:tc>
-          <w:tcPr>
-            <w:tcW w:type="dxa" w:w="979"/>
-          </w:tcPr>
-          <w:p/>
-        </w:tc>
-        <w:tc>
-          <w:tcPr>
-            <w:tcW w:type="dxa" w:w="1066"/>
           </w:tcPr>
           <w:p>
             <w:pPr>
@@ -2776,15 +3682,9 @@
               <w:rPr>
                 <w:sz w:val="15"/>
               </w:rPr>
-              <w:t>0834561</w:t>
+              <w:t>2:45 PM</w:t>
             </w:r>
           </w:p>
-        </w:tc>
-        <w:tc>
-          <w:tcPr>
-            <w:tcW w:type="dxa" w:w="893"/>
-          </w:tcPr>
-          <w:p/>
         </w:tc>
         <w:tc>
           <w:tcPr>
@@ -2809,7 +3709,15 @@
           <w:tcPr>
             <w:tcW w:type="dxa" w:w="1656"/>
           </w:tcPr>
-          <w:p/>
+          <w:p>
+            <w:r/>
+            <w:r>
+              <w:rPr>
+                <w:sz w:val="15"/>
+              </w:rPr>
+              <w:t>Alphonso farm</w:t>
+            </w:r>
+          </w:p>
         </w:tc>
         <w:tc>
           <w:tcPr>
@@ -2832,7 +3740,18 @@
           <w:tcPr>
             <w:tcW w:type="dxa" w:w="979"/>
           </w:tcPr>
-          <w:p/>
+          <w:p>
+            <w:pPr>
+              <w:jc w:val="center"/>
+            </w:pPr>
+            <w:r/>
+            <w:r>
+              <w:rPr>
+                <w:sz w:val="15"/>
+              </w:rPr>
+              <w:t>7.547899</w:t>
+            </w:r>
+          </w:p>
         </w:tc>
         <w:tc>
           <w:tcPr>
@@ -2855,6 +3774,12 @@
           <w:tcPr>
             <w:tcW w:type="dxa" w:w="893"/>
           </w:tcPr>
+          <w:p/>
+        </w:tc>
+        <w:tc>
+          <w:tcPr>
+            <w:tcW w:type="dxa" w:w="3600"/>
+          </w:tcPr>
           <w:p>
             <w:pPr>
               <w:jc w:val="center"/>
@@ -2864,37 +3789,34 @@
               <w:rPr>
                 <w:sz w:val="15"/>
               </w:rPr>
-              <w:t>2:21 PM</w:t>
+              <w:t>—</w:t>
             </w:r>
           </w:p>
         </w:tc>
-        <w:tc>
-          <w:tcPr>
-            <w:tcW w:type="dxa" w:w="3600"/>
-          </w:tcPr>
-          <w:p/>
-        </w:tc>
       </w:tr>
       <w:tr>
         <w:tc>
           <w:tcPr>
             <w:tcW w:type="dxa" w:w="1656"/>
           </w:tcPr>
+          <w:p/>
+        </w:tc>
+        <w:tc>
+          <w:tcPr>
+            <w:tcW w:type="dxa" w:w="1555"/>
+          </w:tcPr>
           <w:p>
+            <w:pPr>
+              <w:jc w:val="center"/>
+            </w:pPr>
             <w:r/>
             <w:r>
               <w:rPr>
                 <w:sz w:val="15"/>
               </w:rPr>
-              <w:t>Neneyee Upstream (northern sediment control station)</w:t>
+              <w:t>NEN-SW-JC-001</w:t>
             </w:r>
           </w:p>
-        </w:tc>
-        <w:tc>
-          <w:tcPr>
-            <w:tcW w:type="dxa" w:w="1555"/>
-          </w:tcPr>
-          <w:p/>
         </w:tc>
         <w:tc>
           <w:tcPr>
@@ -3002,20 +3924,8 @@
         <w:tc>
           <w:tcPr>
             <w:tcW w:type="dxa" w:w="979"/>
-            <w:shd w:val="clear" w:color="auto" w:fill="F2F2F2"/>
-          </w:tcPr>
-          <w:p>
-            <w:pPr>
-              <w:jc w:val="center"/>
-            </w:pPr>
-            <w:r/>
-            <w:r>
-              <w:rPr>
-                <w:sz w:val="15"/>
-              </w:rPr>
-              <w:t>7.56771</w:t>
-            </w:r>
-          </w:p>
+          </w:tcPr>
+          <w:p/>
         </w:tc>
         <w:tc>
           <w:tcPr>
@@ -3088,20 +3998,8 @@
         <w:tc>
           <w:tcPr>
             <w:tcW w:type="dxa" w:w="1555"/>
-            <w:shd w:val="clear" w:color="auto" w:fill="F2F2F2"/>
-          </w:tcPr>
-          <w:p>
-            <w:pPr>
-              <w:jc w:val="center"/>
-            </w:pPr>
-            <w:r/>
-            <w:r>
-              <w:rPr>
-                <w:sz w:val="15"/>
-              </w:rPr>
-              <w:t>W-SW-VA-002</w:t>
-            </w:r>
-          </w:p>
+          </w:tcPr>
+          <w:p/>
         </w:tc>
         <w:tc>
           <w:tcPr>
@@ -3124,38 +4022,14 @@
         <w:tc>
           <w:tcPr>
             <w:tcW w:type="dxa" w:w="1066"/>
-            <w:shd w:val="clear" w:color="auto" w:fill="F2F2F2"/>
-          </w:tcPr>
-          <w:p>
-            <w:pPr>
-              <w:jc w:val="center"/>
-            </w:pPr>
-            <w:r/>
-            <w:r>
-              <w:rPr>
-                <w:sz w:val="15"/>
-              </w:rPr>
-              <w:t>-8.61227</w:t>
-            </w:r>
-          </w:p>
+          </w:tcPr>
+          <w:p/>
         </w:tc>
         <w:tc>
           <w:tcPr>
             <w:tcW w:type="dxa" w:w="893"/>
-            <w:shd w:val="clear" w:color="auto" w:fill="F2F2F2"/>
-          </w:tcPr>
-          <w:p>
-            <w:pPr>
-              <w:jc w:val="center"/>
-            </w:pPr>
-            <w:r/>
-            <w:r>
-              <w:rPr>
-                <w:sz w:val="15"/>
-              </w:rPr>
-              <w:t>3:16 PM</w:t>
-            </w:r>
-          </w:p>
+          </w:tcPr>
+          <w:p/>
         </w:tc>
         <w:tc>
           <w:tcPr>
@@ -3228,6 +4102,32 @@
         <w:tc>
           <w:tcPr>
             <w:tcW w:type="dxa" w:w="1066"/>
+          </w:tcPr>
+          <w:p/>
+        </w:tc>
+        <w:tc>
+          <w:tcPr>
+            <w:tcW w:type="dxa" w:w="893"/>
+          </w:tcPr>
+          <w:p/>
+        </w:tc>
+        <w:tc>
+          <w:tcPr>
+            <w:tcW w:type="dxa" w:w="3600"/>
+          </w:tcPr>
+          <w:p/>
+        </w:tc>
+      </w:tr>
+      <w:tr>
+        <w:tc>
+          <w:tcPr>
+            <w:tcW w:type="dxa" w:w="1656"/>
+          </w:tcPr>
+          <w:p/>
+        </w:tc>
+        <w:tc>
+          <w:tcPr>
+            <w:tcW w:type="dxa" w:w="1555"/>
             <w:shd w:val="clear" w:color="auto" w:fill="F2F2F2"/>
           </w:tcPr>
           <w:p>
@@ -3239,7 +4139,650 @@
               <w:rPr>
                 <w:sz w:val="15"/>
               </w:rPr>
-              <w:t>-8.6128</w:t>
+              <w:t>POM-SW-VA-001</w:t>
+            </w:r>
+          </w:p>
+        </w:tc>
+        <w:tc>
+          <w:tcPr>
+            <w:tcW w:type="dxa" w:w="979"/>
+            <w:shd w:val="clear" w:color="auto" w:fill="F2F2F2"/>
+          </w:tcPr>
+          <w:p>
+            <w:pPr>
+              <w:jc w:val="center"/>
+            </w:pPr>
+            <w:r/>
+            <w:r>
+              <w:rPr>
+                <w:sz w:val="15"/>
+              </w:rPr>
+              <w:t>7.56793</w:t>
+            </w:r>
+          </w:p>
+        </w:tc>
+        <w:tc>
+          <w:tcPr>
+            <w:tcW w:type="dxa" w:w="1066"/>
+          </w:tcPr>
+          <w:p/>
+        </w:tc>
+        <w:tc>
+          <w:tcPr>
+            <w:tcW w:type="dxa" w:w="893"/>
+            <w:shd w:val="clear" w:color="auto" w:fill="F2F2F2"/>
+          </w:tcPr>
+          <w:p>
+            <w:pPr>
+              <w:jc w:val="center"/>
+            </w:pPr>
+            <w:r/>
+            <w:r>
+              <w:rPr>
+                <w:sz w:val="15"/>
+              </w:rPr>
+              <w:t>3:03 PM</w:t>
+            </w:r>
+          </w:p>
+        </w:tc>
+        <w:tc>
+          <w:tcPr>
+            <w:tcW w:type="dxa" w:w="3600"/>
+            <w:shd w:val="clear" w:color="auto" w:fill="F2F2F2"/>
+          </w:tcPr>
+          <w:p>
+            <w:r/>
+            <w:r>
+              <w:rPr>
+                <w:sz w:val="15"/>
+              </w:rPr>
+              <w:t>Downstream surface water sample collected along the Pompleh stream within dense vegetation. Brownish, visibly turbid water with suspended sediment was observed; no visible sign of mine-runoff pollution was noted on the adjacent farmland.</w:t>
+            </w:r>
+          </w:p>
+        </w:tc>
+      </w:tr>
+      <w:tr>
+        <w:tc>
+          <w:tcPr>
+            <w:tcW w:type="dxa" w:w="1656"/>
+            <w:shd w:val="clear" w:color="auto" w:fill="F2F2F2"/>
+          </w:tcPr>
+          <w:p>
+            <w:r/>
+            <w:r>
+              <w:rPr>
+                <w:sz w:val="15"/>
+              </w:rPr>
+              <w:t>Pompleh Mid-point</w:t>
+            </w:r>
+          </w:p>
+        </w:tc>
+        <w:tc>
+          <w:tcPr>
+            <w:tcW w:type="dxa" w:w="1555"/>
+            <w:shd w:val="clear" w:color="auto" w:fill="F2F2F2"/>
+          </w:tcPr>
+          <w:p>
+            <w:pPr>
+              <w:jc w:val="center"/>
+            </w:pPr>
+            <w:r/>
+            <w:r>
+              <w:rPr>
+                <w:sz w:val="15"/>
+              </w:rPr>
+              <w:t>POM-SW-VA-002</w:t>
+            </w:r>
+          </w:p>
+        </w:tc>
+        <w:tc>
+          <w:tcPr>
+            <w:tcW w:type="dxa" w:w="979"/>
+            <w:shd w:val="clear" w:color="auto" w:fill="F2F2F2"/>
+          </w:tcPr>
+          <w:p>
+            <w:pPr>
+              <w:jc w:val="center"/>
+            </w:pPr>
+            <w:r/>
+            <w:r>
+              <w:rPr>
+                <w:sz w:val="15"/>
+              </w:rPr>
+              <w:t>7.56822</w:t>
+            </w:r>
+          </w:p>
+        </w:tc>
+        <w:tc>
+          <w:tcPr>
+            <w:tcW w:type="dxa" w:w="1066"/>
+            <w:shd w:val="clear" w:color="auto" w:fill="F2F2F2"/>
+          </w:tcPr>
+          <w:p>
+            <w:pPr>
+              <w:jc w:val="center"/>
+            </w:pPr>
+            <w:r/>
+            <w:r>
+              <w:rPr>
+                <w:sz w:val="15"/>
+              </w:rPr>
+              <w:t>-8.60947</w:t>
+            </w:r>
+          </w:p>
+        </w:tc>
+        <w:tc>
+          <w:tcPr>
+            <w:tcW w:type="dxa" w:w="893"/>
+          </w:tcPr>
+          <w:p/>
+        </w:tc>
+        <w:tc>
+          <w:tcPr>
+            <w:tcW w:type="dxa" w:w="3600"/>
+            <w:shd w:val="clear" w:color="auto" w:fill="F2F2F2"/>
+          </w:tcPr>
+          <w:p>
+            <w:r/>
+            <w:r>
+              <w:rPr>
+                <w:sz w:val="15"/>
+              </w:rPr>
+              <w:t>Mid-point surface water sample collected along the Pompleh stream. The channel was turbid and reddish-brown, flowing through abundant ground vegetation with uneven, partially eroded streambanks.</w:t>
+            </w:r>
+          </w:p>
+        </w:tc>
+      </w:tr>
+      <w:tr>
+        <w:tc>
+          <w:tcPr>
+            <w:tcW w:type="dxa" w:w="1656"/>
+          </w:tcPr>
+          <w:p/>
+        </w:tc>
+        <w:tc>
+          <w:tcPr>
+            <w:tcW w:type="dxa" w:w="1555"/>
+            <w:shd w:val="clear" w:color="auto" w:fill="F2F2F2"/>
+          </w:tcPr>
+          <w:p>
+            <w:pPr>
+              <w:jc w:val="center"/>
+            </w:pPr>
+            <w:r/>
+            <w:r>
+              <w:rPr>
+                <w:sz w:val="15"/>
+              </w:rPr>
+              <w:t>POM-SW-VA-003</w:t>
+            </w:r>
+          </w:p>
+        </w:tc>
+        <w:tc>
+          <w:tcPr>
+            <w:tcW w:type="dxa" w:w="979"/>
+          </w:tcPr>
+          <w:p/>
+        </w:tc>
+        <w:tc>
+          <w:tcPr>
+            <w:tcW w:type="dxa" w:w="1066"/>
+          </w:tcPr>
+          <w:p/>
+        </w:tc>
+        <w:tc>
+          <w:tcPr>
+            <w:tcW w:type="dxa" w:w="893"/>
+          </w:tcPr>
+          <w:p/>
+        </w:tc>
+        <w:tc>
+          <w:tcPr>
+            <w:tcW w:type="dxa" w:w="3600"/>
+            <w:shd w:val="clear" w:color="auto" w:fill="F2F2F2"/>
+          </w:tcPr>
+          <w:p>
+            <w:r/>
+            <w:r>
+              <w:rPr>
+                <w:sz w:val="15"/>
+              </w:rPr>
+              <w:t>Surface water sample collected further along the Pompleh stream to evaluate the combined sediment load. Water was discoloured and turbid, with suspended particles consistent with soil erosion and sediment runoff into the stream.</w:t>
+            </w:r>
+          </w:p>
+        </w:tc>
+      </w:tr>
+      <w:tr>
+        <w:tc>
+          <w:tcPr>
+            <w:tcW w:type="dxa" w:w="1656"/>
+          </w:tcPr>
+          <w:p/>
+        </w:tc>
+        <w:tc>
+          <w:tcPr>
+            <w:tcW w:type="dxa" w:w="1555"/>
+            <w:shd w:val="clear" w:color="auto" w:fill="F2F2F2"/>
+          </w:tcPr>
+          <w:p>
+            <w:pPr>
+              <w:jc w:val="center"/>
+            </w:pPr>
+            <w:r/>
+            <w:r>
+              <w:rPr>
+                <w:sz w:val="15"/>
+              </w:rPr>
+              <w:t>YEEWA-DS</w:t>
+            </w:r>
+          </w:p>
+        </w:tc>
+        <w:tc>
+          <w:tcPr>
+            <w:tcW w:type="dxa" w:w="979"/>
+            <w:shd w:val="clear" w:color="auto" w:fill="F2F2F2"/>
+          </w:tcPr>
+          <w:p>
+            <w:pPr>
+              <w:jc w:val="center"/>
+            </w:pPr>
+            <w:r/>
+            <w:r>
+              <w:rPr>
+                <w:sz w:val="15"/>
+              </w:rPr>
+              <w:t>542444</w:t>
+            </w:r>
+          </w:p>
+        </w:tc>
+        <w:tc>
+          <w:tcPr>
+            <w:tcW w:type="dxa" w:w="1066"/>
+            <w:shd w:val="clear" w:color="auto" w:fill="F2F2F2"/>
+          </w:tcPr>
+          <w:p>
+            <w:pPr>
+              <w:jc w:val="center"/>
+            </w:pPr>
+            <w:r/>
+            <w:r>
+              <w:rPr>
+                <w:sz w:val="15"/>
+              </w:rPr>
+              <w:t>834881</w:t>
+            </w:r>
+          </w:p>
+        </w:tc>
+        <w:tc>
+          <w:tcPr>
+            <w:tcW w:type="dxa" w:w="893"/>
+            <w:shd w:val="clear" w:color="auto" w:fill="F2F2F2"/>
+          </w:tcPr>
+          <w:p>
+            <w:pPr>
+              <w:jc w:val="center"/>
+            </w:pPr>
+            <w:r/>
+            <w:r>
+              <w:rPr>
+                <w:sz w:val="15"/>
+              </w:rPr>
+              <w:t>2:09 PM</w:t>
+            </w:r>
+          </w:p>
+        </w:tc>
+        <w:tc>
+          <w:tcPr>
+            <w:tcW w:type="dxa" w:w="3600"/>
+            <w:shd w:val="clear" w:color="auto" w:fill="F2F2F2"/>
+          </w:tcPr>
+          <w:p>
+            <w:r/>
+            <w:r>
+              <w:rPr>
+                <w:sz w:val="15"/>
+              </w:rPr>
+              <w:t>Downstream surface water sample collected from the Yeewa main stream, a natural water body, below the inflow of the Yeewa Korweny 1 and 2 tributaries. Iron ore sediment was observed along the waterway and turbidity was visibly higher than at Yeewa Korweny 1.</w:t>
+            </w:r>
+          </w:p>
+        </w:tc>
+      </w:tr>
+      <w:tr>
+        <w:tc>
+          <w:tcPr>
+            <w:tcW w:type="dxa" w:w="1656"/>
+          </w:tcPr>
+          <w:p/>
+        </w:tc>
+        <w:tc>
+          <w:tcPr>
+            <w:tcW w:type="dxa" w:w="1555"/>
+          </w:tcPr>
+          <w:p/>
+        </w:tc>
+        <w:tc>
+          <w:tcPr>
+            <w:tcW w:type="dxa" w:w="979"/>
+            <w:shd w:val="clear" w:color="auto" w:fill="F2F2F2"/>
+          </w:tcPr>
+          <w:p>
+            <w:pPr>
+              <w:jc w:val="center"/>
+            </w:pPr>
+            <w:r/>
+            <w:r>
+              <w:rPr>
+                <w:sz w:val="15"/>
+              </w:rPr>
+              <w:t>542314</w:t>
+            </w:r>
+          </w:p>
+        </w:tc>
+        <w:tc>
+          <w:tcPr>
+            <w:tcW w:type="dxa" w:w="1066"/>
+            <w:shd w:val="clear" w:color="auto" w:fill="F2F2F2"/>
+          </w:tcPr>
+          <w:p>
+            <w:pPr>
+              <w:jc w:val="center"/>
+            </w:pPr>
+            <w:r/>
+            <w:r>
+              <w:rPr>
+                <w:sz w:val="15"/>
+              </w:rPr>
+              <w:t>834915</w:t>
+            </w:r>
+          </w:p>
+        </w:tc>
+        <w:tc>
+          <w:tcPr>
+            <w:tcW w:type="dxa" w:w="893"/>
+            <w:shd w:val="clear" w:color="auto" w:fill="F2F2F2"/>
+          </w:tcPr>
+          <w:p>
+            <w:pPr>
+              <w:jc w:val="center"/>
+            </w:pPr>
+            <w:r/>
+            <w:r>
+              <w:rPr>
+                <w:sz w:val="15"/>
+              </w:rPr>
+              <w:t>2:16 PM</w:t>
+            </w:r>
+          </w:p>
+        </w:tc>
+        <w:tc>
+          <w:tcPr>
+            <w:tcW w:type="dxa" w:w="3600"/>
+          </w:tcPr>
+          <w:p/>
+        </w:tc>
+      </w:tr>
+      <w:tr>
+        <w:tc>
+          <w:tcPr>
+            <w:tcW w:type="dxa" w:w="1656"/>
+          </w:tcPr>
+          <w:p/>
+        </w:tc>
+        <w:tc>
+          <w:tcPr>
+            <w:tcW w:type="dxa" w:w="1555"/>
+          </w:tcPr>
+          <w:p/>
+        </w:tc>
+        <w:tc>
+          <w:tcPr>
+            <w:tcW w:type="dxa" w:w="979"/>
+            <w:shd w:val="clear" w:color="auto" w:fill="F2F2F2"/>
+          </w:tcPr>
+          <w:p>
+            <w:pPr>
+              <w:jc w:val="center"/>
+            </w:pPr>
+            <w:r/>
+            <w:r>
+              <w:rPr>
+                <w:sz w:val="15"/>
+              </w:rPr>
+              <w:t>542066</w:t>
+            </w:r>
+          </w:p>
+        </w:tc>
+        <w:tc>
+          <w:tcPr>
+            <w:tcW w:type="dxa" w:w="1066"/>
+          </w:tcPr>
+          <w:p/>
+        </w:tc>
+        <w:tc>
+          <w:tcPr>
+            <w:tcW w:type="dxa" w:w="893"/>
+            <w:shd w:val="clear" w:color="auto" w:fill="F2F2F2"/>
+          </w:tcPr>
+          <w:p>
+            <w:pPr>
+              <w:jc w:val="center"/>
+            </w:pPr>
+            <w:r/>
+            <w:r>
+              <w:rPr>
+                <w:sz w:val="15"/>
+              </w:rPr>
+              <w:t>2:32 PM</w:t>
+            </w:r>
+          </w:p>
+        </w:tc>
+        <w:tc>
+          <w:tcPr>
+            <w:tcW w:type="dxa" w:w="3600"/>
+          </w:tcPr>
+          <w:p/>
+        </w:tc>
+      </w:tr>
+      <w:tr>
+        <w:tc>
+          <w:tcPr>
+            <w:tcW w:type="dxa" w:w="1656"/>
+          </w:tcPr>
+          <w:p/>
+        </w:tc>
+        <w:tc>
+          <w:tcPr>
+            <w:tcW w:type="dxa" w:w="1555"/>
+            <w:shd w:val="clear" w:color="auto" w:fill="F2F2F2"/>
+          </w:tcPr>
+          <w:p>
+            <w:pPr>
+              <w:jc w:val="center"/>
+            </w:pPr>
+            <w:r/>
+            <w:r>
+              <w:rPr>
+                <w:sz w:val="15"/>
+              </w:rPr>
+              <w:t>YWK2-ES-SW-001</w:t>
+            </w:r>
+          </w:p>
+        </w:tc>
+        <w:tc>
+          <w:tcPr>
+            <w:tcW w:type="dxa" w:w="979"/>
+            <w:shd w:val="clear" w:color="auto" w:fill="F2F2F2"/>
+          </w:tcPr>
+          <w:p>
+            <w:pPr>
+              <w:jc w:val="center"/>
+            </w:pPr>
+            <w:r/>
+            <w:r>
+              <w:rPr>
+                <w:sz w:val="15"/>
+              </w:rPr>
+              <w:t>0541616</w:t>
+            </w:r>
+          </w:p>
+        </w:tc>
+        <w:tc>
+          <w:tcPr>
+            <w:tcW w:type="dxa" w:w="1066"/>
+            <w:shd w:val="clear" w:color="auto" w:fill="F2F2F2"/>
+          </w:tcPr>
+          <w:p>
+            <w:pPr>
+              <w:jc w:val="center"/>
+            </w:pPr>
+            <w:r/>
+            <w:r>
+              <w:rPr>
+                <w:sz w:val="15"/>
+              </w:rPr>
+              <w:t>0835024</w:t>
+            </w:r>
+          </w:p>
+        </w:tc>
+        <w:tc>
+          <w:tcPr>
+            <w:tcW w:type="dxa" w:w="893"/>
+            <w:shd w:val="clear" w:color="auto" w:fill="F2F2F2"/>
+          </w:tcPr>
+          <w:p>
+            <w:pPr>
+              <w:jc w:val="center"/>
+            </w:pPr>
+            <w:r/>
+            <w:r>
+              <w:rPr>
+                <w:sz w:val="15"/>
+              </w:rPr>
+              <w:t>3:15 PM</w:t>
+            </w:r>
+          </w:p>
+        </w:tc>
+        <w:tc>
+          <w:tcPr>
+            <w:tcW w:type="dxa" w:w="3600"/>
+            <w:shd w:val="clear" w:color="auto" w:fill="F2F2F2"/>
+          </w:tcPr>
+          <w:p>
+            <w:r/>
+            <w:r>
+              <w:rPr>
+                <w:sz w:val="15"/>
+              </w:rPr>
+              <w:t>Downstream surface water sample collected from Yeewa Korweny 2 (Patel), a tributary of the Yeewa main stream, just above its junction with the main watercourse. Substantial sediment deposits were observed and turbidity was higher than at Yeewa Korweny 1.</w:t>
+            </w:r>
+          </w:p>
+        </w:tc>
+      </w:tr>
+      <w:tr>
+        <w:tc>
+          <w:tcPr>
+            <w:tcW w:type="dxa" w:w="1656"/>
+          </w:tcPr>
+          <w:p/>
+        </w:tc>
+        <w:tc>
+          <w:tcPr>
+            <w:tcW w:type="dxa" w:w="1555"/>
+            <w:shd w:val="clear" w:color="auto" w:fill="F2F2F2"/>
+          </w:tcPr>
+          <w:p>
+            <w:pPr>
+              <w:jc w:val="center"/>
+            </w:pPr>
+            <w:r/>
+            <w:r>
+              <w:rPr>
+                <w:sz w:val="15"/>
+              </w:rPr>
+              <w:t>YWK2-ES-SW-002</w:t>
+            </w:r>
+          </w:p>
+        </w:tc>
+        <w:tc>
+          <w:tcPr>
+            <w:tcW w:type="dxa" w:w="979"/>
+          </w:tcPr>
+          <w:p/>
+        </w:tc>
+        <w:tc>
+          <w:tcPr>
+            <w:tcW w:type="dxa" w:w="1066"/>
+          </w:tcPr>
+          <w:p/>
+        </w:tc>
+        <w:tc>
+          <w:tcPr>
+            <w:tcW w:type="dxa" w:w="893"/>
+          </w:tcPr>
+          <w:p/>
+        </w:tc>
+        <w:tc>
+          <w:tcPr>
+            <w:tcW w:type="dxa" w:w="3600"/>
+            <w:shd w:val="clear" w:color="auto" w:fill="F2F2F2"/>
+          </w:tcPr>
+          <w:p>
+            <w:r/>
+            <w:r>
+              <w:rPr>
+                <w:sz w:val="15"/>
+              </w:rPr>
+              <w:t>Midstream surface water sample collected along Yeewa Korweny 2 (Patel) within a deep, densely forested valley. A geo-fencing sign reading “KEEP AWAY – 500 Meters Safety Buffer Zone” was observed on this tributary, in proximity to ArcelorMittal’s haulage route.</w:t>
+            </w:r>
+          </w:p>
+        </w:tc>
+      </w:tr>
+      <w:tr>
+        <w:tc>
+          <w:tcPr>
+            <w:tcW w:type="dxa" w:w="1656"/>
+          </w:tcPr>
+          <w:p/>
+        </w:tc>
+        <w:tc>
+          <w:tcPr>
+            <w:tcW w:type="dxa" w:w="1555"/>
+            <w:shd w:val="clear" w:color="auto" w:fill="F2F2F2"/>
+          </w:tcPr>
+          <w:p>
+            <w:pPr>
+              <w:jc w:val="center"/>
+            </w:pPr>
+            <w:r/>
+            <w:r>
+              <w:rPr>
+                <w:sz w:val="15"/>
+              </w:rPr>
+              <w:t>YWK2-ES-SW-003</w:t>
+            </w:r>
+          </w:p>
+        </w:tc>
+        <w:tc>
+          <w:tcPr>
+            <w:tcW w:type="dxa" w:w="979"/>
+          </w:tcPr>
+          <w:p/>
+        </w:tc>
+        <w:tc>
+          <w:tcPr>
+            <w:tcW w:type="dxa" w:w="1066"/>
+            <w:shd w:val="clear" w:color="auto" w:fill="F2F2F2"/>
+          </w:tcPr>
+          <w:p>
+            <w:pPr>
+              <w:jc w:val="center"/>
+            </w:pPr>
+            <w:r/>
+            <w:r>
+              <w:rPr>
+                <w:sz w:val="15"/>
+              </w:rPr>
+              <w:t>0834786</w:t>
             </w:r>
           </w:p>
         </w:tc>
@@ -3264,970 +4807,16 @@
         <w:tc>
           <w:tcPr>
             <w:tcW w:type="dxa" w:w="3600"/>
-            <w:shd w:val="clear" w:color="auto" w:fill="F2F2F2"/>
-          </w:tcPr>
-          <w:p>
-            <w:r/>
-            <w:r>
-              <w:rPr>
-                <w:sz w:val="15"/>
-              </w:rPr>
-              <w:t>Upstream surface water sample collected on the Wehyee stream above the mid-point and downstream stations. Water remained discoloured and turbid under dense tree, shrub and fern cover; disturbed bank sections with exposed soils were noted as possible local sediment sources.</w:t>
-            </w:r>
-          </w:p>
+          </w:tcPr>
+          <w:p/>
         </w:tc>
       </w:tr>
       <w:tr>
         <w:tc>
           <w:tcPr>
             <w:tcW w:type="dxa" w:w="1656"/>
-            <w:shd w:val="clear" w:color="auto" w:fill="F2F2F2"/>
-          </w:tcPr>
-          <w:p>
-            <w:r/>
-            <w:r>
-              <w:rPr>
-                <w:sz w:val="15"/>
-              </w:rPr>
-              <w:t>Pompleh Downstream</w:t>
-            </w:r>
-          </w:p>
-        </w:tc>
-        <w:tc>
-          <w:tcPr>
-            <w:tcW w:type="dxa" w:w="1555"/>
-            <w:shd w:val="clear" w:color="auto" w:fill="F2F2F2"/>
-          </w:tcPr>
-          <w:p>
-            <w:pPr>
-              <w:jc w:val="center"/>
-            </w:pPr>
-            <w:r/>
-            <w:r>
-              <w:rPr>
-                <w:sz w:val="15"/>
-              </w:rPr>
-              <w:t>POM-SW-VA-001</w:t>
-            </w:r>
-          </w:p>
-        </w:tc>
-        <w:tc>
-          <w:tcPr>
-            <w:tcW w:type="dxa" w:w="979"/>
-            <w:shd w:val="clear" w:color="auto" w:fill="F2F2F2"/>
-          </w:tcPr>
-          <w:p>
-            <w:pPr>
-              <w:jc w:val="center"/>
-            </w:pPr>
-            <w:r/>
-            <w:r>
-              <w:rPr>
-                <w:sz w:val="15"/>
-              </w:rPr>
-              <w:t>7.56793</w:t>
-            </w:r>
-          </w:p>
-        </w:tc>
-        <w:tc>
-          <w:tcPr>
-            <w:tcW w:type="dxa" w:w="1066"/>
-            <w:shd w:val="clear" w:color="auto" w:fill="F2F2F2"/>
-          </w:tcPr>
-          <w:p>
-            <w:pPr>
-              <w:jc w:val="center"/>
-            </w:pPr>
-            <w:r/>
-            <w:r>
-              <w:rPr>
-                <w:sz w:val="15"/>
-              </w:rPr>
-              <w:t>-8.6094</w:t>
-            </w:r>
-          </w:p>
-        </w:tc>
-        <w:tc>
-          <w:tcPr>
-            <w:tcW w:type="dxa" w:w="893"/>
-            <w:shd w:val="clear" w:color="auto" w:fill="F2F2F2"/>
-          </w:tcPr>
-          <w:p>
-            <w:pPr>
-              <w:jc w:val="center"/>
-            </w:pPr>
-            <w:r/>
-            <w:r>
-              <w:rPr>
-                <w:sz w:val="15"/>
-              </w:rPr>
-              <w:t>3:03 PM</w:t>
-            </w:r>
-          </w:p>
-        </w:tc>
-        <w:tc>
-          <w:tcPr>
-            <w:tcW w:type="dxa" w:w="3600"/>
-            <w:shd w:val="clear" w:color="auto" w:fill="F2F2F2"/>
-          </w:tcPr>
-          <w:p>
-            <w:r/>
-            <w:r>
-              <w:rPr>
-                <w:sz w:val="15"/>
-              </w:rPr>
-              <w:t>Downstream surface water sample collected along the Pompleh stream within dense vegetation. Brownish, visibly turbid water with suspended sediment was observed; no visible sign of mine-runoff pollution was noted on the adjacent farmland.</w:t>
-            </w:r>
-          </w:p>
-        </w:tc>
-      </w:tr>
-      <w:tr>
-        <w:tc>
-          <w:tcPr>
-            <w:tcW w:type="dxa" w:w="1656"/>
-            <w:shd w:val="clear" w:color="auto" w:fill="F2F2F2"/>
-          </w:tcPr>
-          <w:p>
-            <w:r/>
-            <w:r>
-              <w:rPr>
-                <w:sz w:val="15"/>
-              </w:rPr>
-              <w:t>Pompleh Mid-point</w:t>
-            </w:r>
-          </w:p>
-        </w:tc>
-        <w:tc>
-          <w:tcPr>
-            <w:tcW w:type="dxa" w:w="1555"/>
-            <w:shd w:val="clear" w:color="auto" w:fill="F2F2F2"/>
-          </w:tcPr>
-          <w:p>
-            <w:pPr>
-              <w:jc w:val="center"/>
-            </w:pPr>
-            <w:r/>
-            <w:r>
-              <w:rPr>
-                <w:sz w:val="15"/>
-              </w:rPr>
-              <w:t>POM-SW-VA-002</w:t>
-            </w:r>
-          </w:p>
-        </w:tc>
-        <w:tc>
-          <w:tcPr>
-            <w:tcW w:type="dxa" w:w="979"/>
-            <w:shd w:val="clear" w:color="auto" w:fill="F2F2F2"/>
-          </w:tcPr>
-          <w:p>
-            <w:pPr>
-              <w:jc w:val="center"/>
-            </w:pPr>
-            <w:r/>
-            <w:r>
-              <w:rPr>
-                <w:sz w:val="15"/>
-              </w:rPr>
-              <w:t>7.56822</w:t>
-            </w:r>
-          </w:p>
-        </w:tc>
-        <w:tc>
-          <w:tcPr>
-            <w:tcW w:type="dxa" w:w="1066"/>
-            <w:shd w:val="clear" w:color="auto" w:fill="F2F2F2"/>
-          </w:tcPr>
-          <w:p>
-            <w:pPr>
-              <w:jc w:val="center"/>
-            </w:pPr>
-            <w:r/>
-            <w:r>
-              <w:rPr>
-                <w:sz w:val="15"/>
-              </w:rPr>
-              <w:t>-8.60947</w:t>
-            </w:r>
-          </w:p>
-        </w:tc>
-        <w:tc>
-          <w:tcPr>
-            <w:tcW w:type="dxa" w:w="893"/>
-            <w:shd w:val="clear" w:color="auto" w:fill="F2F2F2"/>
-          </w:tcPr>
-          <w:p>
-            <w:pPr>
-              <w:jc w:val="center"/>
-            </w:pPr>
-            <w:r/>
-            <w:r>
-              <w:rPr>
-                <w:sz w:val="15"/>
-              </w:rPr>
-              <w:t>3:07 PM</w:t>
-            </w:r>
-          </w:p>
-        </w:tc>
-        <w:tc>
-          <w:tcPr>
-            <w:tcW w:type="dxa" w:w="3600"/>
-            <w:shd w:val="clear" w:color="auto" w:fill="F2F2F2"/>
-          </w:tcPr>
-          <w:p>
-            <w:r/>
-            <w:r>
-              <w:rPr>
-                <w:sz w:val="15"/>
-              </w:rPr>
-              <w:t>Mid-point surface water sample collected along the Pompleh stream. The channel was turbid and reddish-brown, flowing through abundant ground vegetation with uneven, partially eroded streambanks.</w:t>
-            </w:r>
-          </w:p>
-        </w:tc>
-      </w:tr>
-      <w:tr>
-        <w:tc>
-          <w:tcPr>
-            <w:tcW w:type="dxa" w:w="1656"/>
-            <w:shd w:val="clear" w:color="auto" w:fill="F2F2F2"/>
-          </w:tcPr>
-          <w:p>
-            <w:r/>
-            <w:r>
-              <w:rPr>
-                <w:sz w:val="15"/>
-              </w:rPr>
-              <w:t>Pompleh Downstream</w:t>
-            </w:r>
-          </w:p>
-        </w:tc>
-        <w:tc>
-          <w:tcPr>
-            <w:tcW w:type="dxa" w:w="1555"/>
-            <w:shd w:val="clear" w:color="auto" w:fill="F2F2F2"/>
-          </w:tcPr>
-          <w:p>
-            <w:pPr>
-              <w:jc w:val="center"/>
-            </w:pPr>
-            <w:r/>
-            <w:r>
-              <w:rPr>
-                <w:sz w:val="15"/>
-              </w:rPr>
-              <w:t>POM-SW-VA-003</w:t>
-            </w:r>
-          </w:p>
-        </w:tc>
-        <w:tc>
-          <w:tcPr>
-            <w:tcW w:type="dxa" w:w="979"/>
-            <w:shd w:val="clear" w:color="auto" w:fill="F2F2F2"/>
-          </w:tcPr>
-          <w:p>
-            <w:pPr>
-              <w:jc w:val="center"/>
-            </w:pPr>
-            <w:r/>
-            <w:r>
-              <w:rPr>
-                <w:sz w:val="15"/>
-              </w:rPr>
-              <w:t>7.56882</w:t>
-            </w:r>
-          </w:p>
-        </w:tc>
-        <w:tc>
-          <w:tcPr>
-            <w:tcW w:type="dxa" w:w="1066"/>
-            <w:shd w:val="clear" w:color="auto" w:fill="F2F2F2"/>
-          </w:tcPr>
-          <w:p>
-            <w:pPr>
-              <w:jc w:val="center"/>
-            </w:pPr>
-            <w:r/>
-            <w:r>
-              <w:rPr>
-                <w:sz w:val="15"/>
-              </w:rPr>
-              <w:t>-8.60976</w:t>
-            </w:r>
-          </w:p>
-        </w:tc>
-        <w:tc>
-          <w:tcPr>
-            <w:tcW w:type="dxa" w:w="893"/>
-            <w:shd w:val="clear" w:color="auto" w:fill="F2F2F2"/>
-          </w:tcPr>
-          <w:p>
-            <w:pPr>
-              <w:jc w:val="center"/>
-            </w:pPr>
-            <w:r/>
-            <w:r>
-              <w:rPr>
-                <w:sz w:val="15"/>
-              </w:rPr>
-              <w:t>3:35 PM</w:t>
-            </w:r>
-          </w:p>
-        </w:tc>
-        <w:tc>
-          <w:tcPr>
-            <w:tcW w:type="dxa" w:w="3600"/>
-            <w:shd w:val="clear" w:color="auto" w:fill="F2F2F2"/>
-          </w:tcPr>
-          <w:p>
-            <w:r/>
-            <w:r>
-              <w:rPr>
-                <w:sz w:val="15"/>
-              </w:rPr>
-              <w:t>Surface water sample collected further along the Pompleh stream to evaluate the combined sediment load. Water was discoloured and turbid, with suspended particles consistent with soil erosion and sediment runoff into the stream.</w:t>
-            </w:r>
-          </w:p>
-        </w:tc>
-      </w:tr>
-      <w:tr>
-        <w:tc>
-          <w:tcPr>
-            <w:tcW w:type="dxa" w:w="1656"/>
-            <w:shd w:val="clear" w:color="auto" w:fill="F2F2F2"/>
-          </w:tcPr>
-          <w:p>
-            <w:r/>
-            <w:r>
-              <w:rPr>
-                <w:sz w:val="15"/>
-              </w:rPr>
-              <w:t>Yeewa Downstream</w:t>
-            </w:r>
-          </w:p>
-        </w:tc>
-        <w:tc>
-          <w:tcPr>
-            <w:tcW w:type="dxa" w:w="1555"/>
-            <w:shd w:val="clear" w:color="auto" w:fill="F2F2F2"/>
-          </w:tcPr>
-          <w:p>
-            <w:pPr>
-              <w:jc w:val="center"/>
-            </w:pPr>
-            <w:r/>
-            <w:r>
-              <w:rPr>
-                <w:sz w:val="15"/>
-              </w:rPr>
-              <w:t>YEEWA-DS</w:t>
-            </w:r>
-          </w:p>
-        </w:tc>
-        <w:tc>
-          <w:tcPr>
-            <w:tcW w:type="dxa" w:w="979"/>
-            <w:shd w:val="clear" w:color="auto" w:fill="F2F2F2"/>
-          </w:tcPr>
-          <w:p>
-            <w:pPr>
-              <w:jc w:val="center"/>
-            </w:pPr>
-            <w:r/>
-            <w:r>
-              <w:rPr>
-                <w:sz w:val="15"/>
-              </w:rPr>
-              <w:t>542444</w:t>
-            </w:r>
-          </w:p>
-        </w:tc>
-        <w:tc>
-          <w:tcPr>
-            <w:tcW w:type="dxa" w:w="1066"/>
-            <w:shd w:val="clear" w:color="auto" w:fill="F2F2F2"/>
-          </w:tcPr>
-          <w:p>
-            <w:pPr>
-              <w:jc w:val="center"/>
-            </w:pPr>
-            <w:r/>
-            <w:r>
-              <w:rPr>
-                <w:sz w:val="15"/>
-              </w:rPr>
-              <w:t>834881</w:t>
-            </w:r>
-          </w:p>
-        </w:tc>
-        <w:tc>
-          <w:tcPr>
-            <w:tcW w:type="dxa" w:w="893"/>
-            <w:shd w:val="clear" w:color="auto" w:fill="F2F2F2"/>
-          </w:tcPr>
-          <w:p>
-            <w:pPr>
-              <w:jc w:val="center"/>
-            </w:pPr>
-            <w:r/>
-            <w:r>
-              <w:rPr>
-                <w:sz w:val="15"/>
-              </w:rPr>
-              <w:t>2:09 PM</w:t>
-            </w:r>
-          </w:p>
-        </w:tc>
-        <w:tc>
-          <w:tcPr>
-            <w:tcW w:type="dxa" w:w="3600"/>
-            <w:shd w:val="clear" w:color="auto" w:fill="F2F2F2"/>
-          </w:tcPr>
-          <w:p>
-            <w:r/>
-            <w:r>
-              <w:rPr>
-                <w:sz w:val="15"/>
-              </w:rPr>
-              <w:t>Downstream surface water sample collected from the Yeewa main stream, a natural water body, below the inflow of the Yeewa Korweny 1 and 2 tributaries. Iron ore sediment was observed along the waterway and turbidity was visibly higher than at Yeewa Korweny 1.</w:t>
-            </w:r>
-          </w:p>
-        </w:tc>
-      </w:tr>
-      <w:tr>
-        <w:tc>
-          <w:tcPr>
-            <w:tcW w:type="dxa" w:w="1656"/>
-            <w:shd w:val="clear" w:color="auto" w:fill="F2F2F2"/>
-          </w:tcPr>
-          <w:p>
-            <w:r/>
-            <w:r>
-              <w:rPr>
-                <w:sz w:val="15"/>
-              </w:rPr>
-              <w:t>Yeewa Mid-Stream</w:t>
-            </w:r>
-          </w:p>
-        </w:tc>
-        <w:tc>
-          <w:tcPr>
-            <w:tcW w:type="dxa" w:w="1555"/>
-            <w:shd w:val="clear" w:color="auto" w:fill="F2F2F2"/>
-          </w:tcPr>
-          <w:p>
-            <w:pPr>
-              <w:jc w:val="center"/>
-            </w:pPr>
-            <w:r/>
-            <w:r>
-              <w:rPr>
-                <w:sz w:val="15"/>
-              </w:rPr>
-              <w:t>YEEWA-MS</w:t>
-            </w:r>
-          </w:p>
-        </w:tc>
-        <w:tc>
-          <w:tcPr>
-            <w:tcW w:type="dxa" w:w="979"/>
-            <w:shd w:val="clear" w:color="auto" w:fill="F2F2F2"/>
-          </w:tcPr>
-          <w:p>
-            <w:pPr>
-              <w:jc w:val="center"/>
-            </w:pPr>
-            <w:r/>
-            <w:r>
-              <w:rPr>
-                <w:sz w:val="15"/>
-              </w:rPr>
-              <w:t>542314</w:t>
-            </w:r>
-          </w:p>
-        </w:tc>
-        <w:tc>
-          <w:tcPr>
-            <w:tcW w:type="dxa" w:w="1066"/>
-            <w:shd w:val="clear" w:color="auto" w:fill="F2F2F2"/>
-          </w:tcPr>
-          <w:p>
-            <w:pPr>
-              <w:jc w:val="center"/>
-            </w:pPr>
-            <w:r/>
-            <w:r>
-              <w:rPr>
-                <w:sz w:val="15"/>
-              </w:rPr>
-              <w:t>834915</w:t>
-            </w:r>
-          </w:p>
-        </w:tc>
-        <w:tc>
-          <w:tcPr>
-            <w:tcW w:type="dxa" w:w="893"/>
-            <w:shd w:val="clear" w:color="auto" w:fill="F2F2F2"/>
-          </w:tcPr>
-          <w:p>
-            <w:pPr>
-              <w:jc w:val="center"/>
-            </w:pPr>
-            <w:r/>
-            <w:r>
-              <w:rPr>
-                <w:sz w:val="15"/>
-              </w:rPr>
-              <w:t>2:16 PM</w:t>
-            </w:r>
-          </w:p>
-        </w:tc>
-        <w:tc>
-          <w:tcPr>
-            <w:tcW w:type="dxa" w:w="3600"/>
-            <w:shd w:val="clear" w:color="auto" w:fill="F2F2F2"/>
-          </w:tcPr>
-          <w:p>
-            <w:r/>
-            <w:r>
-              <w:rPr>
-                <w:sz w:val="15"/>
-              </w:rPr>
-              <w:t>Mid-stream surface water sample collected along the Yeewa main stream to assess spatial sediment migration. Reddish iron ore sediment deposits were observed along the channel, with elevated turbidity.</w:t>
-            </w:r>
-          </w:p>
-        </w:tc>
-      </w:tr>
-      <w:tr>
-        <w:tc>
-          <w:tcPr>
-            <w:tcW w:type="dxa" w:w="1656"/>
-            <w:shd w:val="clear" w:color="auto" w:fill="F2F2F2"/>
-          </w:tcPr>
-          <w:p>
-            <w:r/>
-            <w:r>
-              <w:rPr>
-                <w:sz w:val="15"/>
-              </w:rPr>
-              <w:t>Yeewa Up-Stream</w:t>
-            </w:r>
-          </w:p>
-        </w:tc>
-        <w:tc>
-          <w:tcPr>
-            <w:tcW w:type="dxa" w:w="1555"/>
-            <w:shd w:val="clear" w:color="auto" w:fill="F2F2F2"/>
-          </w:tcPr>
-          <w:p>
-            <w:pPr>
-              <w:jc w:val="center"/>
-            </w:pPr>
-            <w:r/>
-            <w:r>
-              <w:rPr>
-                <w:sz w:val="15"/>
-              </w:rPr>
-              <w:t>YEEWA-US</w:t>
-            </w:r>
-          </w:p>
-        </w:tc>
-        <w:tc>
-          <w:tcPr>
-            <w:tcW w:type="dxa" w:w="979"/>
-            <w:shd w:val="clear" w:color="auto" w:fill="F2F2F2"/>
-          </w:tcPr>
-          <w:p>
-            <w:pPr>
-              <w:jc w:val="center"/>
-            </w:pPr>
-            <w:r/>
-            <w:r>
-              <w:rPr>
-                <w:sz w:val="15"/>
-              </w:rPr>
-              <w:t>542066</w:t>
-            </w:r>
-          </w:p>
-        </w:tc>
-        <w:tc>
-          <w:tcPr>
-            <w:tcW w:type="dxa" w:w="1066"/>
-            <w:shd w:val="clear" w:color="auto" w:fill="F2F2F2"/>
-          </w:tcPr>
-          <w:p>
-            <w:pPr>
-              <w:jc w:val="center"/>
-            </w:pPr>
-            <w:r/>
-            <w:r>
-              <w:rPr>
-                <w:sz w:val="15"/>
-              </w:rPr>
-              <w:t>835147</w:t>
-            </w:r>
-          </w:p>
-        </w:tc>
-        <w:tc>
-          <w:tcPr>
-            <w:tcW w:type="dxa" w:w="893"/>
-            <w:shd w:val="clear" w:color="auto" w:fill="F2F2F2"/>
-          </w:tcPr>
-          <w:p>
-            <w:pPr>
-              <w:jc w:val="center"/>
-            </w:pPr>
-            <w:r/>
-            <w:r>
-              <w:rPr>
-                <w:sz w:val="15"/>
-              </w:rPr>
-              <w:t>2:32 PM</w:t>
-            </w:r>
-          </w:p>
-        </w:tc>
-        <w:tc>
-          <w:tcPr>
-            <w:tcW w:type="dxa" w:w="3600"/>
-            <w:shd w:val="clear" w:color="auto" w:fill="F2F2F2"/>
-          </w:tcPr>
-          <w:p>
-            <w:r/>
-            <w:r>
-              <w:rPr>
-                <w:sz w:val="15"/>
-              </w:rPr>
-              <w:t>Upstream surface water sample collected on the Yeewa main stream above the tributary junctions. Iron ore sediment was still present along the waterway at this point, indicating sediment loading from further upstream in the Mount Yewlliton drainage.</w:t>
-            </w:r>
-          </w:p>
-        </w:tc>
-      </w:tr>
-      <w:tr>
-        <w:tc>
-          <w:tcPr>
-            <w:tcW w:type="dxa" w:w="1656"/>
-            <w:shd w:val="clear" w:color="auto" w:fill="F2F2F2"/>
-          </w:tcPr>
-          <w:p>
-            <w:r/>
-            <w:r>
-              <w:rPr>
-                <w:sz w:val="15"/>
-              </w:rPr>
-              <w:t>Yeewa Korweny Patel Downstream</w:t>
-            </w:r>
-          </w:p>
-        </w:tc>
-        <w:tc>
-          <w:tcPr>
-            <w:tcW w:type="dxa" w:w="1555"/>
-            <w:shd w:val="clear" w:color="auto" w:fill="F2F2F2"/>
-          </w:tcPr>
-          <w:p>
-            <w:pPr>
-              <w:jc w:val="center"/>
-            </w:pPr>
-            <w:r/>
-            <w:r>
-              <w:rPr>
-                <w:sz w:val="15"/>
-              </w:rPr>
-              <w:t>YWK2-ES-SW-001</w:t>
-            </w:r>
-          </w:p>
-        </w:tc>
-        <w:tc>
-          <w:tcPr>
-            <w:tcW w:type="dxa" w:w="979"/>
-            <w:shd w:val="clear" w:color="auto" w:fill="F2F2F2"/>
-          </w:tcPr>
-          <w:p>
-            <w:pPr>
-              <w:jc w:val="center"/>
-            </w:pPr>
-            <w:r/>
-            <w:r>
-              <w:rPr>
-                <w:sz w:val="15"/>
-              </w:rPr>
-              <w:t>0541616</w:t>
-            </w:r>
-          </w:p>
-        </w:tc>
-        <w:tc>
-          <w:tcPr>
-            <w:tcW w:type="dxa" w:w="1066"/>
-            <w:shd w:val="clear" w:color="auto" w:fill="F2F2F2"/>
-          </w:tcPr>
-          <w:p>
-            <w:pPr>
-              <w:jc w:val="center"/>
-            </w:pPr>
-            <w:r/>
-            <w:r>
-              <w:rPr>
-                <w:sz w:val="15"/>
-              </w:rPr>
-              <w:t>0835024</w:t>
-            </w:r>
-          </w:p>
-        </w:tc>
-        <w:tc>
-          <w:tcPr>
-            <w:tcW w:type="dxa" w:w="893"/>
-            <w:shd w:val="clear" w:color="auto" w:fill="F2F2F2"/>
-          </w:tcPr>
-          <w:p>
-            <w:pPr>
-              <w:jc w:val="center"/>
-            </w:pPr>
-            <w:r/>
-            <w:r>
-              <w:rPr>
-                <w:sz w:val="15"/>
-              </w:rPr>
-              <w:t>3:15 PM</w:t>
-            </w:r>
-          </w:p>
-        </w:tc>
-        <w:tc>
-          <w:tcPr>
-            <w:tcW w:type="dxa" w:w="3600"/>
-            <w:shd w:val="clear" w:color="auto" w:fill="F2F2F2"/>
-          </w:tcPr>
-          <w:p>
-            <w:r/>
-            <w:r>
-              <w:rPr>
-                <w:sz w:val="15"/>
-              </w:rPr>
-              <w:t>Downstream surface water sample collected from Yeewa Korweny 2 (Patel), a tributary of the Yeewa main stream, just above its junction with the main watercourse. Substantial sediment deposits were observed and turbidity was higher than at Yeewa Korweny 1.</w:t>
-            </w:r>
-          </w:p>
-        </w:tc>
-      </w:tr>
-      <w:tr>
-        <w:tc>
-          <w:tcPr>
-            <w:tcW w:type="dxa" w:w="1656"/>
-            <w:shd w:val="clear" w:color="auto" w:fill="F2F2F2"/>
-          </w:tcPr>
-          <w:p>
-            <w:r/>
-            <w:r>
-              <w:rPr>
-                <w:sz w:val="15"/>
-              </w:rPr>
-              <w:t>Yeewa Korweny Patel Midstream</w:t>
-            </w:r>
-          </w:p>
-        </w:tc>
-        <w:tc>
-          <w:tcPr>
-            <w:tcW w:type="dxa" w:w="1555"/>
-            <w:shd w:val="clear" w:color="auto" w:fill="F2F2F2"/>
-          </w:tcPr>
-          <w:p>
-            <w:pPr>
-              <w:jc w:val="center"/>
-            </w:pPr>
-            <w:r/>
-            <w:r>
-              <w:rPr>
-                <w:sz w:val="15"/>
-              </w:rPr>
-              <w:t>YWK2-ES-SW-002</w:t>
-            </w:r>
-          </w:p>
-        </w:tc>
-        <w:tc>
-          <w:tcPr>
-            <w:tcW w:type="dxa" w:w="979"/>
-            <w:shd w:val="clear" w:color="auto" w:fill="F2F2F2"/>
-          </w:tcPr>
-          <w:p>
-            <w:pPr>
-              <w:jc w:val="center"/>
-            </w:pPr>
-            <w:r/>
-            <w:r>
-              <w:rPr>
-                <w:sz w:val="15"/>
-              </w:rPr>
-              <w:t>0541600</w:t>
-            </w:r>
-          </w:p>
-        </w:tc>
-        <w:tc>
-          <w:tcPr>
-            <w:tcW w:type="dxa" w:w="1066"/>
-            <w:shd w:val="clear" w:color="auto" w:fill="F2F2F2"/>
-          </w:tcPr>
-          <w:p>
-            <w:pPr>
-              <w:jc w:val="center"/>
-            </w:pPr>
-            <w:r/>
-            <w:r>
-              <w:rPr>
-                <w:sz w:val="15"/>
-              </w:rPr>
-              <w:t>0834909</w:t>
-            </w:r>
-          </w:p>
-        </w:tc>
-        <w:tc>
-          <w:tcPr>
-            <w:tcW w:type="dxa" w:w="893"/>
-            <w:shd w:val="clear" w:color="auto" w:fill="F2F2F2"/>
-          </w:tcPr>
-          <w:p>
-            <w:pPr>
-              <w:jc w:val="center"/>
-            </w:pPr>
-            <w:r/>
-            <w:r>
-              <w:rPr>
-                <w:sz w:val="15"/>
-              </w:rPr>
-              <w:t>3:18 PM</w:t>
-            </w:r>
-          </w:p>
-        </w:tc>
-        <w:tc>
-          <w:tcPr>
-            <w:tcW w:type="dxa" w:w="3600"/>
-            <w:shd w:val="clear" w:color="auto" w:fill="F2F2F2"/>
-          </w:tcPr>
-          <w:p>
-            <w:r/>
-            <w:r>
-              <w:rPr>
-                <w:sz w:val="15"/>
-              </w:rPr>
-              <w:t>Midstream surface water sample collected along Yeewa Korweny 2 (Patel) within a deep, densely forested valley. A geo-fencing sign reading “KEEP AWAY – 500 Meters Safety Buffer Zone” was observed on this tributary, in proximity to ArcelorMittal’s haulage route.</w:t>
-            </w:r>
-          </w:p>
-        </w:tc>
-      </w:tr>
-      <w:tr>
-        <w:tc>
-          <w:tcPr>
-            <w:tcW w:type="dxa" w:w="1656"/>
-            <w:shd w:val="clear" w:color="auto" w:fill="F2F2F2"/>
-          </w:tcPr>
-          <w:p>
-            <w:r/>
-            <w:r>
-              <w:rPr>
-                <w:sz w:val="15"/>
-              </w:rPr>
-              <w:t>Yeewa Korweny Patel Upstream</w:t>
-            </w:r>
-          </w:p>
-        </w:tc>
-        <w:tc>
-          <w:tcPr>
-            <w:tcW w:type="dxa" w:w="1555"/>
-            <w:shd w:val="clear" w:color="auto" w:fill="F2F2F2"/>
-          </w:tcPr>
-          <w:p>
-            <w:pPr>
-              <w:jc w:val="center"/>
-            </w:pPr>
-            <w:r/>
-            <w:r>
-              <w:rPr>
-                <w:sz w:val="15"/>
-              </w:rPr>
-              <w:t>YWK2-ES-SW-003</w:t>
-            </w:r>
-          </w:p>
-        </w:tc>
-        <w:tc>
-          <w:tcPr>
-            <w:tcW w:type="dxa" w:w="979"/>
-            <w:shd w:val="clear" w:color="auto" w:fill="F2F2F2"/>
-          </w:tcPr>
-          <w:p>
-            <w:pPr>
-              <w:jc w:val="center"/>
-            </w:pPr>
-            <w:r/>
-            <w:r>
-              <w:rPr>
-                <w:sz w:val="15"/>
-              </w:rPr>
-              <w:t>0541550</w:t>
-            </w:r>
-          </w:p>
-        </w:tc>
-        <w:tc>
-          <w:tcPr>
-            <w:tcW w:type="dxa" w:w="1066"/>
-            <w:shd w:val="clear" w:color="auto" w:fill="F2F2F2"/>
-          </w:tcPr>
-          <w:p>
-            <w:pPr>
-              <w:jc w:val="center"/>
-            </w:pPr>
-            <w:r/>
-            <w:r>
-              <w:rPr>
-                <w:sz w:val="15"/>
-              </w:rPr>
-              <w:t>0834786</w:t>
-            </w:r>
-          </w:p>
-        </w:tc>
-        <w:tc>
-          <w:tcPr>
-            <w:tcW w:type="dxa" w:w="893"/>
-            <w:shd w:val="clear" w:color="auto" w:fill="F2F2F2"/>
-          </w:tcPr>
-          <w:p>
-            <w:pPr>
-              <w:jc w:val="center"/>
-            </w:pPr>
-            <w:r/>
-            <w:r>
-              <w:rPr>
-                <w:sz w:val="15"/>
-              </w:rPr>
-              <w:t>3:21 PM</w:t>
-            </w:r>
-          </w:p>
-        </w:tc>
-        <w:tc>
-          <w:tcPr>
-            <w:tcW w:type="dxa" w:w="3600"/>
-            <w:shd w:val="clear" w:color="auto" w:fill="F2F2F2"/>
-          </w:tcPr>
-          <w:p>
-            <w:r/>
-            <w:r>
-              <w:rPr>
-                <w:sz w:val="15"/>
-              </w:rPr>
-              <w:t>Upstream surface water sample collected on Yeewa Korweny 2 (Patel) towards its source in the Mount Yewlliton area, in proximity to mining activities in the Mount Yewlliton and Mount Gangro areas. Sediment deposits were observed in the channel.</w:t>
-            </w:r>
-          </w:p>
-        </w:tc>
-      </w:tr>
-      <w:tr>
-        <w:tc>
-          <w:tcPr>
-            <w:tcW w:type="dxa" w:w="1656"/>
-            <w:shd w:val="clear" w:color="auto" w:fill="F2F2F2"/>
-          </w:tcPr>
-          <w:p>
-            <w:r/>
-            <w:r>
-              <w:rPr>
-                <w:sz w:val="15"/>
-              </w:rPr>
-              <w:t>Yeewa korweny Dor Downstream</w:t>
-            </w:r>
-          </w:p>
+          </w:tcPr>
+          <w:p/>
         </w:tc>
         <w:tc>
           <w:tcPr>
@@ -4250,106 +4839,40 @@
         <w:tc>
           <w:tcPr>
             <w:tcW w:type="dxa" w:w="979"/>
-            <w:shd w:val="clear" w:color="auto" w:fill="F2F2F2"/>
-          </w:tcPr>
-          <w:p>
-            <w:pPr>
-              <w:jc w:val="center"/>
-            </w:pPr>
-            <w:r/>
-            <w:r>
-              <w:rPr>
-                <w:sz w:val="15"/>
-              </w:rPr>
-              <w:t>0541697</w:t>
-            </w:r>
-          </w:p>
+          </w:tcPr>
+          <w:p/>
         </w:tc>
         <w:tc>
           <w:tcPr>
             <w:tcW w:type="dxa" w:w="1066"/>
-            <w:shd w:val="clear" w:color="auto" w:fill="F2F2F2"/>
-          </w:tcPr>
-          <w:p>
-            <w:pPr>
-              <w:jc w:val="center"/>
-            </w:pPr>
-            <w:r/>
-            <w:r>
-              <w:rPr>
-                <w:sz w:val="15"/>
-              </w:rPr>
-              <w:t>0835051</w:t>
-            </w:r>
-          </w:p>
+          </w:tcPr>
+          <w:p/>
         </w:tc>
         <w:tc>
           <w:tcPr>
             <w:tcW w:type="dxa" w:w="893"/>
-            <w:shd w:val="clear" w:color="auto" w:fill="F2F2F2"/>
-          </w:tcPr>
-          <w:p>
-            <w:pPr>
-              <w:jc w:val="center"/>
-            </w:pPr>
-            <w:r/>
-            <w:r>
-              <w:rPr>
-                <w:sz w:val="15"/>
-              </w:rPr>
-              <w:t>3:35 PM</w:t>
-            </w:r>
-          </w:p>
+          </w:tcPr>
+          <w:p/>
         </w:tc>
         <w:tc>
           <w:tcPr>
             <w:tcW w:type="dxa" w:w="3600"/>
-            <w:shd w:val="clear" w:color="auto" w:fill="F2F2F2"/>
-          </w:tcPr>
-          <w:p>
-            <w:r/>
-            <w:r>
-              <w:rPr>
-                <w:sz w:val="15"/>
-              </w:rPr>
-              <w:t>Downstream surface water sample collected from Yeewa Korweny 1 (Dor), the tributary on the opposite side of the Yeewa main stream from Yeewa Korweny 2, near its junction with the main watercourse. Sediment deposits were present but turbidity was visibly lower than at Yeewa and Yeewa Korweny 2.</w:t>
-            </w:r>
-          </w:p>
+          </w:tcPr>
+          <w:p/>
         </w:tc>
       </w:tr>
       <w:tr>
         <w:tc>
           <w:tcPr>
             <w:tcW w:type="dxa" w:w="1656"/>
-            <w:shd w:val="clear" w:color="auto" w:fill="F2F2F2"/>
-          </w:tcPr>
-          <w:p>
-            <w:r/>
-            <w:r>
-              <w:rPr>
-                <w:sz w:val="15"/>
-              </w:rPr>
-              <w:t>Yeewa Korweny Dor Midstream</w:t>
-            </w:r>
-          </w:p>
+          </w:tcPr>
+          <w:p/>
         </w:tc>
         <w:tc>
           <w:tcPr>
             <w:tcW w:type="dxa" w:w="1555"/>
-            <w:shd w:val="clear" w:color="auto" w:fill="F2F2F2"/>
-          </w:tcPr>
-          <w:p>
-            <w:pPr>
-              <w:jc w:val="center"/>
-            </w:pPr>
-            <w:r/>
-            <w:r>
-              <w:rPr>
-                <w:sz w:val="15"/>
-              </w:rPr>
-              <w:t>YWK1-ES-SW-002</w:t>
-            </w:r>
-          </w:p>
+          </w:tcPr>
+          <w:p/>
         </w:tc>
         <w:tc>
           <w:tcPr>
@@ -4390,35 +4913,14 @@
         <w:tc>
           <w:tcPr>
             <w:tcW w:type="dxa" w:w="893"/>
-            <w:shd w:val="clear" w:color="auto" w:fill="F2F2F2"/>
-          </w:tcPr>
-          <w:p>
-            <w:pPr>
-              <w:jc w:val="center"/>
-            </w:pPr>
-            <w:r/>
-            <w:r>
-              <w:rPr>
-                <w:sz w:val="15"/>
-              </w:rPr>
-              <w:t>3:44 PM</w:t>
-            </w:r>
-          </w:p>
+          </w:tcPr>
+          <w:p/>
         </w:tc>
         <w:tc>
           <w:tcPr>
             <w:tcW w:type="dxa" w:w="3600"/>
-            <w:shd w:val="clear" w:color="auto" w:fill="F2F2F2"/>
-          </w:tcPr>
-          <w:p>
-            <w:r/>
-            <w:r>
-              <w:rPr>
-                <w:sz w:val="15"/>
-              </w:rPr>
-              <w:t>Midstream surface water sample collected along Yeewa Korweny 1 (Dor) as it flows through a deep valley under dense forest cover. Sediment deposits were observed, with lower turbidity than the Yeewa Korweny 2 branch.</w:t>
-            </w:r>
-          </w:p>
+          </w:tcPr>
+          <w:p/>
         </w:tc>
       </w:tr>
       <w:tr>
@@ -4440,20 +4942,8 @@
         <w:tc>
           <w:tcPr>
             <w:tcW w:type="dxa" w:w="1555"/>
-            <w:shd w:val="clear" w:color="auto" w:fill="F2F2F2"/>
-          </w:tcPr>
-          <w:p>
-            <w:pPr>
-              <w:jc w:val="center"/>
-            </w:pPr>
-            <w:r/>
-            <w:r>
-              <w:rPr>
-                <w:sz w:val="15"/>
-              </w:rPr>
-              <w:t>YWK1-ES-SW-003</w:t>
-            </w:r>
-          </w:p>
+          </w:tcPr>
+          <w:p/>
         </w:tc>
         <w:tc>
           <w:tcPr>
@@ -4883,6 +5373,42 @@
           <w:tcPr>
             <w:tcW w:type="dxa" w:w="2736"/>
           </w:tcPr>
+          <w:p/>
+        </w:tc>
+        <w:tc>
+          <w:tcPr>
+            <w:tcW w:type="dxa" w:w="2437"/>
+            <w:vMerge/>
+          </w:tcPr>
+          <w:p/>
+        </w:tc>
+        <w:tc>
+          <w:tcPr>
+            <w:tcW w:type="dxa" w:w="2437"/>
+            <w:vMerge/>
+          </w:tcPr>
+          <w:p/>
+        </w:tc>
+      </w:tr>
+      <w:tr>
+        <w:tc>
+          <w:tcPr>
+            <w:tcW w:type="dxa" w:w="2448"/>
+          </w:tcPr>
+          <w:p>
+            <w:r/>
+            <w:r>
+              <w:rPr>
+                <w:sz w:val="18"/>
+              </w:rPr>
+              <w:t>YWK2-ES-SW-002</w:t>
+            </w:r>
+          </w:p>
+        </w:tc>
+        <w:tc>
+          <w:tcPr>
+            <w:tcW w:type="dxa" w:w="2736"/>
+          </w:tcPr>
           <w:p>
             <w:pPr>
               <w:jc w:val="center"/>
@@ -4892,45 +5418,9 @@
               <w:rPr>
                 <w:sz w:val="18"/>
               </w:rPr>
-              <w:t>1858</w:t>
+              <w:t>2,400</w:t>
             </w:r>
           </w:p>
-        </w:tc>
-        <w:tc>
-          <w:tcPr>
-            <w:tcW w:type="dxa" w:w="2437"/>
-            <w:vMerge/>
-          </w:tcPr>
-          <w:p/>
-        </w:tc>
-        <w:tc>
-          <w:tcPr>
-            <w:tcW w:type="dxa" w:w="2437"/>
-            <w:vMerge/>
-          </w:tcPr>
-          <w:p/>
-        </w:tc>
-      </w:tr>
-      <w:tr>
-        <w:tc>
-          <w:tcPr>
-            <w:tcW w:type="dxa" w:w="2448"/>
-          </w:tcPr>
-          <w:p>
-            <w:r/>
-            <w:r>
-              <w:rPr>
-                <w:sz w:val="18"/>
-              </w:rPr>
-              <w:t>YWK2-ES-SW-002</w:t>
-            </w:r>
-          </w:p>
-        </w:tc>
-        <w:tc>
-          <w:tcPr>
-            <w:tcW w:type="dxa" w:w="2736"/>
-          </w:tcPr>
-          <w:p/>
         </w:tc>
         <w:tc>
           <w:tcPr>
@@ -4966,37 +5456,40 @@
           <w:tcPr>
             <w:tcW w:type="dxa" w:w="2736"/>
           </w:tcPr>
-          <w:p/>
-        </w:tc>
-        <w:tc>
-          <w:tcPr>
-            <w:tcW w:type="dxa" w:w="2437"/>
-            <w:vMerge/>
-          </w:tcPr>
-          <w:p/>
-        </w:tc>
-        <w:tc>
-          <w:tcPr>
-            <w:tcW w:type="dxa" w:w="2437"/>
-            <w:vMerge/>
-          </w:tcPr>
-          <w:p/>
-        </w:tc>
-      </w:tr>
-      <w:tr>
-        <w:tc>
-          <w:tcPr>
-            <w:tcW w:type="dxa" w:w="2448"/>
-          </w:tcPr>
           <w:p>
+            <w:pPr>
+              <w:jc w:val="center"/>
+            </w:pPr>
             <w:r/>
             <w:r>
               <w:rPr>
                 <w:sz w:val="18"/>
               </w:rPr>
-              <w:t>YWK1-ES-SW-001</w:t>
+              <w:t>769</w:t>
             </w:r>
           </w:p>
+        </w:tc>
+        <w:tc>
+          <w:tcPr>
+            <w:tcW w:type="dxa" w:w="2437"/>
+            <w:vMerge/>
+          </w:tcPr>
+          <w:p/>
+        </w:tc>
+        <w:tc>
+          <w:tcPr>
+            <w:tcW w:type="dxa" w:w="2437"/>
+            <w:vMerge/>
+          </w:tcPr>
+          <w:p/>
+        </w:tc>
+      </w:tr>
+      <w:tr>
+        <w:tc>
+          <w:tcPr>
+            <w:tcW w:type="dxa" w:w="2448"/>
+          </w:tcPr>
+          <w:p/>
         </w:tc>
         <w:tc>
           <w:tcPr>
@@ -5063,13 +5556,41 @@
           <w:tcPr>
             <w:tcW w:type="dxa" w:w="2448"/>
           </w:tcPr>
+          <w:p/>
+        </w:tc>
+        <w:tc>
+          <w:tcPr>
+            <w:tcW w:type="dxa" w:w="2736"/>
+          </w:tcPr>
+          <w:p/>
+        </w:tc>
+        <w:tc>
+          <w:tcPr>
+            <w:tcW w:type="dxa" w:w="2437"/>
+            <w:vMerge/>
+          </w:tcPr>
+          <w:p/>
+        </w:tc>
+        <w:tc>
+          <w:tcPr>
+            <w:tcW w:type="dxa" w:w="2437"/>
+            <w:vMerge/>
+          </w:tcPr>
+          <w:p/>
+        </w:tc>
+      </w:tr>
+      <w:tr>
+        <w:tc>
+          <w:tcPr>
+            <w:tcW w:type="dxa" w:w="2448"/>
+          </w:tcPr>
           <w:p>
             <w:r/>
             <w:r>
               <w:rPr>
                 <w:sz w:val="18"/>
               </w:rPr>
-              <w:t>YWK1-ES-SW-003</w:t>
+              <w:t>W-SW-VA-001</w:t>
             </w:r>
           </w:p>
         </w:tc>
@@ -5077,40 +5598,121 @@
           <w:tcPr>
             <w:tcW w:type="dxa" w:w="2736"/>
           </w:tcPr>
+          <w:p/>
+        </w:tc>
+        <w:tc>
+          <w:tcPr>
+            <w:tcW w:type="dxa" w:w="2437"/>
+            <w:vMerge/>
+          </w:tcPr>
+          <w:p/>
+        </w:tc>
+        <w:tc>
+          <w:tcPr>
+            <w:tcW w:type="dxa" w:w="2437"/>
+            <w:vMerge/>
+          </w:tcPr>
+          <w:p/>
+        </w:tc>
+      </w:tr>
+      <w:tr>
+        <w:tc>
+          <w:tcPr>
+            <w:tcW w:type="dxa" w:w="2448"/>
+          </w:tcPr>
+          <w:p/>
+        </w:tc>
+        <w:tc>
+          <w:tcPr>
+            <w:tcW w:type="dxa" w:w="2736"/>
+          </w:tcPr>
+          <w:p/>
+        </w:tc>
+        <w:tc>
+          <w:tcPr>
+            <w:tcW w:type="dxa" w:w="2437"/>
+            <w:vMerge/>
+          </w:tcPr>
+          <w:p/>
+        </w:tc>
+        <w:tc>
+          <w:tcPr>
+            <w:tcW w:type="dxa" w:w="2437"/>
+            <w:vMerge/>
+          </w:tcPr>
+          <w:p/>
+        </w:tc>
+      </w:tr>
+      <w:tr>
+        <w:tc>
+          <w:tcPr>
+            <w:tcW w:type="dxa" w:w="2448"/>
+          </w:tcPr>
+          <w:p/>
+        </w:tc>
+        <w:tc>
+          <w:tcPr>
+            <w:tcW w:type="dxa" w:w="2736"/>
+          </w:tcPr>
+          <w:p/>
+        </w:tc>
+        <w:tc>
+          <w:tcPr>
+            <w:tcW w:type="dxa" w:w="2437"/>
+            <w:vMerge/>
+          </w:tcPr>
+          <w:p/>
+        </w:tc>
+        <w:tc>
+          <w:tcPr>
+            <w:tcW w:type="dxa" w:w="2437"/>
+            <w:vMerge/>
+          </w:tcPr>
+          <w:p/>
+        </w:tc>
+      </w:tr>
+      <w:tr>
+        <w:tc>
+          <w:tcPr>
+            <w:tcW w:type="dxa" w:w="2448"/>
+          </w:tcPr>
+          <w:p/>
+        </w:tc>
+        <w:tc>
+          <w:tcPr>
+            <w:tcW w:type="dxa" w:w="2736"/>
+          </w:tcPr>
+          <w:p/>
+        </w:tc>
+        <w:tc>
+          <w:tcPr>
+            <w:tcW w:type="dxa" w:w="2437"/>
+            <w:vMerge/>
+          </w:tcPr>
+          <w:p/>
+        </w:tc>
+        <w:tc>
+          <w:tcPr>
+            <w:tcW w:type="dxa" w:w="2437"/>
+            <w:vMerge/>
+          </w:tcPr>
+          <w:p/>
+        </w:tc>
+      </w:tr>
+      <w:tr>
+        <w:tc>
+          <w:tcPr>
+            <w:tcW w:type="dxa" w:w="2448"/>
+          </w:tcPr>
           <w:p>
-            <w:pPr>
-              <w:jc w:val="center"/>
-            </w:pPr>
             <w:r/>
             <w:r>
               <w:rPr>
                 <w:sz w:val="18"/>
               </w:rPr>
-              <w:t>188</w:t>
+              <w:t>POM-SW-VA-002</w:t>
             </w:r>
           </w:p>
-        </w:tc>
-        <w:tc>
-          <w:tcPr>
-            <w:tcW w:type="dxa" w:w="2437"/>
-            <w:vMerge/>
-          </w:tcPr>
-          <w:p/>
-        </w:tc>
-        <w:tc>
-          <w:tcPr>
-            <w:tcW w:type="dxa" w:w="2437"/>
-            <w:vMerge/>
-          </w:tcPr>
-          <w:p/>
-        </w:tc>
-      </w:tr>
-      <w:tr>
-        <w:tc>
-          <w:tcPr>
-            <w:tcW w:type="dxa" w:w="2448"/>
-          </w:tcPr>
-          <w:p/>
         </w:tc>
         <w:tc>
           <w:tcPr>
@@ -5149,13 +5751,41 @@
           <w:tcPr>
             <w:tcW w:type="dxa" w:w="2448"/>
           </w:tcPr>
+          <w:p/>
+        </w:tc>
+        <w:tc>
+          <w:tcPr>
+            <w:tcW w:type="dxa" w:w="2736"/>
+          </w:tcPr>
+          <w:p/>
+        </w:tc>
+        <w:tc>
+          <w:tcPr>
+            <w:tcW w:type="dxa" w:w="2437"/>
+            <w:vMerge/>
+          </w:tcPr>
+          <w:p/>
+        </w:tc>
+        <w:tc>
+          <w:tcPr>
+            <w:tcW w:type="dxa" w:w="2437"/>
+            <w:vMerge/>
+          </w:tcPr>
+          <w:p/>
+        </w:tc>
+      </w:tr>
+      <w:tr>
+        <w:tc>
+          <w:tcPr>
+            <w:tcW w:type="dxa" w:w="2448"/>
+          </w:tcPr>
           <w:p>
             <w:r/>
             <w:r>
               <w:rPr>
                 <w:sz w:val="18"/>
               </w:rPr>
-              <w:t>W-SW-VA-002</w:t>
+              <w:t>WE-JC-SW-001</w:t>
             </w:r>
           </w:p>
         </w:tc>
@@ -5185,32 +5815,13 @@
           <w:tcPr>
             <w:tcW w:type="dxa" w:w="2448"/>
           </w:tcPr>
-          <w:p>
-            <w:r/>
-            <w:r>
-              <w:rPr>
-                <w:sz w:val="18"/>
-              </w:rPr>
-              <w:t>W-SW-VA-003</w:t>
-            </w:r>
-          </w:p>
+          <w:p/>
         </w:tc>
         <w:tc>
           <w:tcPr>
             <w:tcW w:type="dxa" w:w="2736"/>
           </w:tcPr>
-          <w:p>
-            <w:pPr>
-              <w:jc w:val="center"/>
-            </w:pPr>
-            <w:r/>
-            <w:r>
-              <w:rPr>
-                <w:sz w:val="18"/>
-              </w:rPr>
-              <w:t>20</w:t>
-            </w:r>
-          </w:p>
+          <w:p/>
         </w:tc>
         <w:tc>
           <w:tcPr>
@@ -5233,162 +5844,6 @@
             <w:tcW w:type="dxa" w:w="2448"/>
           </w:tcPr>
           <w:p/>
-        </w:tc>
-        <w:tc>
-          <w:tcPr>
-            <w:tcW w:type="dxa" w:w="2736"/>
-          </w:tcPr>
-          <w:p/>
-        </w:tc>
-        <w:tc>
-          <w:tcPr>
-            <w:tcW w:type="dxa" w:w="2437"/>
-            <w:vMerge/>
-          </w:tcPr>
-          <w:p/>
-        </w:tc>
-        <w:tc>
-          <w:tcPr>
-            <w:tcW w:type="dxa" w:w="2437"/>
-            <w:vMerge/>
-          </w:tcPr>
-          <w:p/>
-        </w:tc>
-      </w:tr>
-      <w:tr>
-        <w:tc>
-          <w:tcPr>
-            <w:tcW w:type="dxa" w:w="2448"/>
-          </w:tcPr>
-          <w:p>
-            <w:r/>
-            <w:r>
-              <w:rPr>
-                <w:sz w:val="18"/>
-              </w:rPr>
-              <w:t>POM-SW-VA-002</w:t>
-            </w:r>
-          </w:p>
-        </w:tc>
-        <w:tc>
-          <w:tcPr>
-            <w:tcW w:type="dxa" w:w="2736"/>
-          </w:tcPr>
-          <w:p/>
-        </w:tc>
-        <w:tc>
-          <w:tcPr>
-            <w:tcW w:type="dxa" w:w="2437"/>
-            <w:vMerge/>
-          </w:tcPr>
-          <w:p/>
-        </w:tc>
-        <w:tc>
-          <w:tcPr>
-            <w:tcW w:type="dxa" w:w="2437"/>
-            <w:vMerge/>
-          </w:tcPr>
-          <w:p/>
-        </w:tc>
-      </w:tr>
-      <w:tr>
-        <w:tc>
-          <w:tcPr>
-            <w:tcW w:type="dxa" w:w="2448"/>
-          </w:tcPr>
-          <w:p/>
-        </w:tc>
-        <w:tc>
-          <w:tcPr>
-            <w:tcW w:type="dxa" w:w="2736"/>
-          </w:tcPr>
-          <w:p/>
-        </w:tc>
-        <w:tc>
-          <w:tcPr>
-            <w:tcW w:type="dxa" w:w="2437"/>
-            <w:vMerge/>
-          </w:tcPr>
-          <w:p/>
-        </w:tc>
-        <w:tc>
-          <w:tcPr>
-            <w:tcW w:type="dxa" w:w="2437"/>
-            <w:vMerge/>
-          </w:tcPr>
-          <w:p/>
-        </w:tc>
-      </w:tr>
-      <w:tr>
-        <w:tc>
-          <w:tcPr>
-            <w:tcW w:type="dxa" w:w="2448"/>
-          </w:tcPr>
-          <w:p/>
-        </w:tc>
-        <w:tc>
-          <w:tcPr>
-            <w:tcW w:type="dxa" w:w="2736"/>
-          </w:tcPr>
-          <w:p/>
-        </w:tc>
-        <w:tc>
-          <w:tcPr>
-            <w:tcW w:type="dxa" w:w="2437"/>
-            <w:vMerge/>
-          </w:tcPr>
-          <w:p/>
-        </w:tc>
-        <w:tc>
-          <w:tcPr>
-            <w:tcW w:type="dxa" w:w="2437"/>
-            <w:vMerge/>
-          </w:tcPr>
-          <w:p/>
-        </w:tc>
-      </w:tr>
-      <w:tr>
-        <w:tc>
-          <w:tcPr>
-            <w:tcW w:type="dxa" w:w="2448"/>
-          </w:tcPr>
-          <w:p/>
-        </w:tc>
-        <w:tc>
-          <w:tcPr>
-            <w:tcW w:type="dxa" w:w="2736"/>
-          </w:tcPr>
-          <w:p/>
-        </w:tc>
-        <w:tc>
-          <w:tcPr>
-            <w:tcW w:type="dxa" w:w="2437"/>
-            <w:vMerge/>
-          </w:tcPr>
-          <w:p/>
-        </w:tc>
-        <w:tc>
-          <w:tcPr>
-            <w:tcW w:type="dxa" w:w="2437"/>
-            <w:vMerge/>
-          </w:tcPr>
-          <w:p/>
-        </w:tc>
-      </w:tr>
-      <w:tr>
-        <w:tc>
-          <w:tcPr>
-            <w:tcW w:type="dxa" w:w="2448"/>
-          </w:tcPr>
-          <w:p>
-            <w:r/>
-            <w:r>
-              <w:rPr>
-                <w:sz w:val="18"/>
-              </w:rPr>
-              <w:t>WE-SW-JC-003</w:t>
-            </w:r>
-          </w:p>
         </w:tc>
         <w:tc>
           <w:tcPr>
@@ -5433,18 +5888,35 @@
           <w:tcPr>
             <w:tcW w:type="dxa" w:w="2736"/>
           </w:tcPr>
-          <w:p>
-            <w:pPr>
-              <w:jc w:val="center"/>
-            </w:pPr>
-            <w:r/>
-            <w:r>
-              <w:rPr>
-                <w:sz w:val="18"/>
-              </w:rPr>
-              <w:t>84</w:t>
-            </w:r>
-          </w:p>
+          <w:p/>
+        </w:tc>
+        <w:tc>
+          <w:tcPr>
+            <w:tcW w:type="dxa" w:w="2437"/>
+            <w:vMerge/>
+          </w:tcPr>
+          <w:p/>
+        </w:tc>
+        <w:tc>
+          <w:tcPr>
+            <w:tcW w:type="dxa" w:w="2437"/>
+            <w:vMerge/>
+          </w:tcPr>
+          <w:p/>
+        </w:tc>
+      </w:tr>
+      <w:tr>
+        <w:tc>
+          <w:tcPr>
+            <w:tcW w:type="dxa" w:w="2448"/>
+          </w:tcPr>
+          <w:p/>
+        </w:tc>
+        <w:tc>
+          <w:tcPr>
+            <w:tcW w:type="dxa" w:w="2736"/>
+          </w:tcPr>
+          <w:p/>
         </w:tc>
         <w:tc>
           <w:tcPr>
@@ -5472,7 +5944,7 @@
               <w:rPr>
                 <w:sz w:val="18"/>
               </w:rPr>
-              <w:t>AF-SW-JC-00</w:t>
+              <w:t>NEN-SW-JC-001</w:t>
             </w:r>
           </w:p>
         </w:tc>
@@ -5480,57 +5952,7 @@
           <w:tcPr>
             <w:tcW w:type="dxa" w:w="2736"/>
           </w:tcPr>
-          <w:p>
-            <w:pPr>
-              <w:jc w:val="center"/>
-            </w:pPr>
-            <w:r/>
-            <w:r>
-              <w:rPr>
-                <w:sz w:val="18"/>
-              </w:rPr>
-              <w:t>1067</w:t>
-            </w:r>
-          </w:p>
-        </w:tc>
-        <w:tc>
-          <w:tcPr>
-            <w:tcW w:type="dxa" w:w="2437"/>
-            <w:vMerge/>
-          </w:tcPr>
           <w:p/>
-        </w:tc>
-        <w:tc>
-          <w:tcPr>
-            <w:tcW w:type="dxa" w:w="2437"/>
-            <w:vMerge/>
-          </w:tcPr>
-          <w:p/>
-        </w:tc>
-      </w:tr>
-      <w:tr>
-        <w:tc>
-          <w:tcPr>
-            <w:tcW w:type="dxa" w:w="2448"/>
-          </w:tcPr>
-          <w:p/>
-        </w:tc>
-        <w:tc>
-          <w:tcPr>
-            <w:tcW w:type="dxa" w:w="2736"/>
-          </w:tcPr>
-          <w:p>
-            <w:pPr>
-              <w:jc w:val="center"/>
-            </w:pPr>
-            <w:r/>
-            <w:r>
-              <w:rPr>
-                <w:sz w:val="18"/>
-              </w:rPr>
-              <w:t>92</w:t>
-            </w:r>
-          </w:p>
         </w:tc>
         <w:tc>
           <w:tcPr>
@@ -5675,20 +6097,7 @@
             <w:tcW w:type="dxa" w:w="2952"/>
             <w:shd w:val="clear" w:color="auto" w:fill="404040"/>
           </w:tcPr>
-          <w:p>
-            <w:pPr>
-              <w:jc w:val="center"/>
-            </w:pPr>
-            <w:r/>
-            <w:r>
-              <w:rPr>
-                <w:b/>
-                <w:color w:val="FFFFFF"/>
-                <w:sz w:val="17"/>
-              </w:rPr>
-              <w:t>Relative to LWQS Class III (≤50 mg/L)</w:t>
-            </w:r>
-          </w:p>
+          <w:p/>
         </w:tc>
       </w:tr>
       <w:tr>
@@ -5710,7 +6119,15 @@
           <w:tcPr>
             <w:tcW w:type="dxa" w:w="2736"/>
           </w:tcPr>
-          <w:p/>
+          <w:p>
+            <w:r/>
+            <w:r>
+              <w:rPr>
+                <w:sz w:val="17"/>
+              </w:rPr>
+              <w:t>YEEWA-DS / MS / US</w:t>
+            </w:r>
+          </w:p>
         </w:tc>
         <w:tc>
           <w:tcPr>
@@ -5777,13 +6194,32 @@
           <w:tcPr>
             <w:tcW w:type="dxa" w:w="1728"/>
           </w:tcPr>
-          <w:p/>
+          <w:p>
+            <w:pPr>
+              <w:jc w:val="center"/>
+            </w:pPr>
+            <w:r/>
+            <w:r>
+              <w:rPr>
+                <w:sz w:val="17"/>
+              </w:rPr>
+              <w:t>769 – 2,400</w:t>
+            </w:r>
+          </w:p>
         </w:tc>
         <w:tc>
           <w:tcPr>
             <w:tcW w:type="dxa" w:w="2952"/>
           </w:tcPr>
-          <w:p/>
+          <w:p>
+            <w:r/>
+            <w:r>
+              <w:rPr>
+                <w:sz w:val="17"/>
+              </w:rPr>
+              <w:t>All exceed (≈15–48×); highest of the survey</w:t>
+            </w:r>
+          </w:p>
         </w:tc>
       </w:tr>
       <w:tr>
@@ -5805,7 +6241,15 @@
           <w:tcPr>
             <w:tcW w:type="dxa" w:w="2736"/>
           </w:tcPr>
-          <w:p/>
+          <w:p>
+            <w:r/>
+            <w:r>
+              <w:rPr>
+                <w:sz w:val="17"/>
+              </w:rPr>
+              <w:t>YWK1-ES-SW-001 – 003</w:t>
+            </w:r>
+          </w:p>
         </w:tc>
         <w:tc>
           <w:tcPr>

</xml_diff>